<commit_message>
Refactor SoilFariR script and add TSBF matrix
Reorganize and clean up 3-SoilFariR/SoilFariR_script.R: expand comment separators and section headers, move creation of combined observer-transect variable earlier, and add TSBF-specific contingency matrix (tsbfcon) by subsetting df_soil for method == "TSBF" and constructing obs_transect. Reorder multivariate analysis setup (decostand usage retained) and add placeholders/headers for TSBF and co-inertia analyses. Also include updated manuscript binary files (DOCX and PDF).
</commit_message>
<xml_diff>
--- a/6-manuscripts/RAPPORT INTERMéDIAIRE - 11mar2026.docx
+++ b/6-manuscripts/RAPPORT INTERMéDIAIRE - 11mar2026.docx
@@ -181,6 +181,7 @@
       </w:pPr>
       <w:r>
         <w:rPr>
+          <w:noProof/>
           <w:lang w:val="en-US"/>
         </w:rPr>
         <w:drawing>
@@ -263,6 +264,9 @@
         <w:jc w:val="both"/>
       </w:pPr>
       <w:r>
+        <w:rPr>
+          <w:noProof/>
+        </w:rPr>
         <w:drawing>
           <wp:inline distT="0" distB="0" distL="0" distR="0" wp14:anchorId="67DF37C0" wp14:editId="796AC0B9">
             <wp:extent cx="2257740" cy="1133633"/>
@@ -316,16 +320,16 @@
     </w:p>
     <w:p>
       <w:pPr>
-        <w:jc w:val="both"/>
+        <w:jc w:val="center"/>
       </w:pPr>
       <w:r>
         <w:rPr>
           <w:noProof/>
         </w:rPr>
         <w:drawing>
-          <wp:inline distT="0" distB="0" distL="0" distR="0" wp14:anchorId="4366CD25" wp14:editId="27C64C8F">
-            <wp:extent cx="5760720" cy="5752465"/>
-            <wp:effectExtent l="0" t="0" r="0" b="635"/>
+          <wp:inline distT="0" distB="0" distL="0" distR="0" wp14:anchorId="4366CD25" wp14:editId="760FF1F6">
+            <wp:extent cx="5799510" cy="5791200"/>
+            <wp:effectExtent l="0" t="0" r="0" b="0"/>
             <wp:docPr id="2" name="Image 2"/>
             <wp:cNvGraphicFramePr>
               <a:graphicFrameLocks xmlns:a="http://schemas.openxmlformats.org/drawingml/2006/main" noChangeAspect="1"/>
@@ -346,7 +350,7 @@
                   <pic:spPr>
                     <a:xfrm>
                       <a:off x="0" y="0"/>
-                      <a:ext cx="5760720" cy="5752465"/>
+                      <a:ext cx="5822614" cy="5814271"/>
                     </a:xfrm>
                     <a:prstGeom prst="rect">
                       <a:avLst/>
@@ -368,6 +372,80 @@
       </w:r>
       <w:r>
         <w:t>’ACP réalisée sur le tableau 1 (à savoir, les observations via le protocole SoilFari).</w:t>
+      </w:r>
+    </w:p>
+    <w:p>
+      <w:pPr>
+        <w:jc w:val="center"/>
+      </w:pPr>
+      <w:r>
+        <w:rPr>
+          <w:noProof/>
+        </w:rPr>
+        <w:lastRenderedPageBreak/>
+        <w:drawing>
+          <wp:inline distT="0" distB="0" distL="0" distR="0" wp14:anchorId="5E6C2536" wp14:editId="50648F19">
+            <wp:extent cx="5057775" cy="5050528"/>
+            <wp:effectExtent l="0" t="0" r="0" b="0"/>
+            <wp:docPr id="4" name="Image 4"/>
+            <wp:cNvGraphicFramePr>
+              <a:graphicFrameLocks xmlns:a="http://schemas.openxmlformats.org/drawingml/2006/main" noChangeAspect="1"/>
+            </wp:cNvGraphicFramePr>
+            <a:graphic xmlns:a="http://schemas.openxmlformats.org/drawingml/2006/main">
+              <a:graphicData uri="http://schemas.openxmlformats.org/drawingml/2006/picture">
+                <pic:pic xmlns:pic="http://schemas.openxmlformats.org/drawingml/2006/picture">
+                  <pic:nvPicPr>
+                    <pic:cNvPr id="1" name=""/>
+                    <pic:cNvPicPr/>
+                  </pic:nvPicPr>
+                  <pic:blipFill>
+                    <a:blip r:embed="rId7"/>
+                    <a:stretch>
+                      <a:fillRect/>
+                    </a:stretch>
+                  </pic:blipFill>
+                  <pic:spPr>
+                    <a:xfrm>
+                      <a:off x="0" y="0"/>
+                      <a:ext cx="5066641" cy="5059382"/>
+                    </a:xfrm>
+                    <a:prstGeom prst="rect">
+                      <a:avLst/>
+                    </a:prstGeom>
+                  </pic:spPr>
+                </pic:pic>
+              </a:graphicData>
+            </a:graphic>
+          </wp:inline>
+        </w:drawing>
+      </w:r>
+    </w:p>
+    <w:p>
+      <w:pPr>
+        <w:jc w:val="center"/>
+      </w:pPr>
+      <w:r>
+        <w:t>Figure 2. Diagramme de Shepard pour l’ACP sur les données de SoilFari</w:t>
+      </w:r>
+    </w:p>
+    <w:p>
+      <w:pPr>
+        <w:jc w:val="both"/>
+      </w:pPr>
+      <w:r>
+        <w:rPr>
+          <w:b/>
+          <w:bCs/>
+        </w:rPr>
+        <w:t>Analyse de co-inertie :</w:t>
+      </w:r>
+    </w:p>
+    <w:p>
+      <w:pPr>
+        <w:jc w:val="both"/>
+      </w:pPr>
+      <w:r>
+        <w:t>L’analyse d co-inertie portant sur 2 tableaux, on va réaliser une deuxième ACP, mais sur les données de TSBF.</w:t>
       </w:r>
     </w:p>
     <w:sectPr>

</xml_diff>

<commit_message>
add betadiv script for clarity and other minor changes
</commit_message>
<xml_diff>
--- a/6-manuscripts/RAPPORT INTERMéDIAIRE - 11mar2026.docx
+++ b/6-manuscripts/RAPPORT INTERMéDIAIRE - 11mar2026.docx
@@ -7,15 +7,7 @@
         <w:jc w:val="center"/>
       </w:pPr>
       <w:r>
-        <w:t xml:space="preserve">RAPPORT </w:t>
-      </w:r>
-      <w:proofErr w:type="spellStart"/>
-      <w:r>
-        <w:t>INTERMéDIAIRE</w:t>
-      </w:r>
-      <w:proofErr w:type="spellEnd"/>
-      <w:r>
-        <w:t xml:space="preserve"> </w:t>
+        <w:t xml:space="preserve">RAPPORT INTERMéDIAIRE </w:t>
       </w:r>
       <w:r>
         <w:t>– Analyses de la diversité des sols européens</w:t>
@@ -28,22 +20,12 @@
       <w:r>
         <w:t xml:space="preserve">Script principal : </w:t>
       </w:r>
-      <w:proofErr w:type="spellStart"/>
       <w:r>
         <w:rPr>
           <w:color w:val="FF0000"/>
         </w:rPr>
-        <w:t>SoilFari_</w:t>
-      </w:r>
-      <w:proofErr w:type="gramStart"/>
-      <w:r>
-        <w:rPr>
-          <w:color w:val="FF0000"/>
-        </w:rPr>
-        <w:t>script.R</w:t>
-      </w:r>
-      <w:proofErr w:type="spellEnd"/>
-      <w:proofErr w:type="gramEnd"/>
+        <w:t>SoilFari_script.R</w:t>
+      </w:r>
     </w:p>
     <w:p>
       <w:pPr>
@@ -56,24 +38,13 @@
       <w:r>
         <w:t xml:space="preserve">Script fonctions : </w:t>
       </w:r>
-      <w:proofErr w:type="spellStart"/>
       <w:r>
         <w:rPr>
           <w:color w:val="FF0000"/>
           <w:u w:val="single"/>
         </w:rPr>
-        <w:t>SoilFari_</w:t>
-      </w:r>
-      <w:proofErr w:type="gramStart"/>
-      <w:r>
-        <w:rPr>
-          <w:color w:val="FF0000"/>
-          <w:u w:val="single"/>
-        </w:rPr>
-        <w:t>functions.R</w:t>
-      </w:r>
-      <w:proofErr w:type="spellEnd"/>
-      <w:proofErr w:type="gramEnd"/>
+        <w:t>SoilFari_functions.R</w:t>
+      </w:r>
     </w:p>
     <w:p>
       <w:pPr>
@@ -88,49 +59,25 @@
         <w:rPr>
           <w:lang w:val="en-US"/>
         </w:rPr>
-        <w:t xml:space="preserve">Work </w:t>
-      </w:r>
-      <w:proofErr w:type="gramStart"/>
-      <w:r>
-        <w:rPr>
-          <w:lang w:val="en-US"/>
-        </w:rPr>
-        <w:t>directory :</w:t>
-      </w:r>
-      <w:proofErr w:type="gramEnd"/>
-      <w:r>
-        <w:rPr>
-          <w:lang w:val="en-US"/>
-        </w:rPr>
-        <w:t xml:space="preserve"> </w:t>
-      </w:r>
-      <w:proofErr w:type="spellStart"/>
+        <w:t xml:space="preserve">Work directory : </w:t>
+      </w:r>
       <w:r>
         <w:rPr>
           <w:color w:val="4472C4" w:themeColor="accent1"/>
           <w:u w:val="single"/>
           <w:lang w:val="en-US"/>
         </w:rPr>
-        <w:t>setwd</w:t>
-      </w:r>
-      <w:proofErr w:type="spellEnd"/>
-      <w:r>
+        <w:t>setwd('D:/GitHub/AI4SH/4-DataFrames_ready')</w:t>
+      </w:r>
+    </w:p>
+    <w:p>
+      <w:pPr>
+        <w:jc w:val="both"/>
         <w:rPr>
           <w:color w:val="4472C4" w:themeColor="accent1"/>
           <w:u w:val="single"/>
           <w:lang w:val="en-US"/>
         </w:rPr>
-        <w:t>('D:/GitHub/AI4SH/4-DataFrames_ready')</w:t>
-      </w:r>
-    </w:p>
-    <w:p>
-      <w:pPr>
-        <w:jc w:val="both"/>
-        <w:rPr>
-          <w:color w:val="4472C4" w:themeColor="accent1"/>
-          <w:u w:val="single"/>
-          <w:lang w:val="en-US"/>
-        </w:rPr>
       </w:pPr>
     </w:p>
     <w:p>
@@ -150,77 +97,21 @@
         <w:rPr>
           <w:color w:val="000000" w:themeColor="text1"/>
         </w:rPr>
-        <w:t xml:space="preserve"> tableaux de données : ceux pour les résultats de TSBF et ceux pour les observations faites avec la méthode </w:t>
-      </w:r>
-      <w:proofErr w:type="spellStart"/>
-      <w:r>
-        <w:rPr>
-          <w:color w:val="000000" w:themeColor="text1"/>
-        </w:rPr>
-        <w:t>SoilFari</w:t>
-      </w:r>
-      <w:proofErr w:type="spellEnd"/>
-      <w:r>
-        <w:rPr>
-          <w:color w:val="000000" w:themeColor="text1"/>
-        </w:rPr>
-        <w:t xml:space="preserve">, enregistrées sur </w:t>
-      </w:r>
-      <w:proofErr w:type="spellStart"/>
-      <w:r>
-        <w:rPr>
-          <w:color w:val="000000" w:themeColor="text1"/>
-        </w:rPr>
-        <w:t>iNaturalist</w:t>
-      </w:r>
-      <w:proofErr w:type="spellEnd"/>
-      <w:r>
-        <w:rPr>
-          <w:color w:val="000000" w:themeColor="text1"/>
-        </w:rPr>
-        <w:t>.</w:t>
-      </w:r>
-    </w:p>
-    <w:p>
-      <w:pPr>
-        <w:jc w:val="both"/>
-        <w:rPr>
-          <w:color w:val="000000" w:themeColor="text1"/>
-        </w:rPr>
-      </w:pPr>
-      <w:r>
-        <w:rPr>
-          <w:color w:val="000000" w:themeColor="text1"/>
-        </w:rPr>
-        <w:t xml:space="preserve">Les 150 </w:t>
-      </w:r>
-      <w:proofErr w:type="gramStart"/>
-      <w:r>
-        <w:rPr>
-          <w:color w:val="000000" w:themeColor="text1"/>
-        </w:rPr>
-        <w:t>premières ligne</w:t>
-      </w:r>
-      <w:proofErr w:type="gramEnd"/>
-      <w:r>
-        <w:rPr>
-          <w:color w:val="000000" w:themeColor="text1"/>
-        </w:rPr>
-        <w:t xml:space="preserve"> du script principal sont là pour charger les packages, les </w:t>
-      </w:r>
-      <w:proofErr w:type="spellStart"/>
-      <w:r>
-        <w:rPr>
-          <w:color w:val="000000" w:themeColor="text1"/>
-        </w:rPr>
-        <w:t>dataframes</w:t>
-      </w:r>
-      <w:proofErr w:type="spellEnd"/>
-      <w:r>
-        <w:rPr>
-          <w:color w:val="000000" w:themeColor="text1"/>
-        </w:rPr>
-        <w:t xml:space="preserve"> et process ces derniers notamment grâce au script fonctions.</w:t>
+        <w:t xml:space="preserve"> tableaux de données : ceux pour les résultats de TSBF et ceux pour les observations faites avec la méthode SoilFari, enregistrées sur iNaturalist.</w:t>
+      </w:r>
+    </w:p>
+    <w:p>
+      <w:pPr>
+        <w:jc w:val="both"/>
+        <w:rPr>
+          <w:color w:val="000000" w:themeColor="text1"/>
+        </w:rPr>
+      </w:pPr>
+      <w:r>
+        <w:rPr>
+          <w:color w:val="000000" w:themeColor="text1"/>
+        </w:rPr>
+        <w:t>Les 150 premières ligne du script principal sont là pour charger les packages, les dataframes et process ces derniers notamment grâce au script fonctions.</w:t>
       </w:r>
     </w:p>
     <w:p>
@@ -253,51 +144,46 @@
     </w:p>
     <w:p>
       <w:pPr>
-        <w:jc w:val="both"/>
-        <w:rPr>
-          <w:color w:val="000000" w:themeColor="text1"/>
-        </w:rPr>
-      </w:pPr>
-    </w:p>
-    <w:p>
-      <w:pPr>
-        <w:jc w:val="both"/>
-        <w:rPr>
-          <w:color w:val="000000" w:themeColor="text1"/>
-        </w:rPr>
-      </w:pPr>
-      <w:r>
-        <w:rPr>
-          <w:color w:val="000000" w:themeColor="text1"/>
-        </w:rPr>
-        <w:t>Enfin, une dernière partie du script s’attache aux analyses de diversité multivariées. Le tableau 1 représente une partie du tableau utilisé pour les analyses, à savoir les taxa observés par chaque personne/transect.</w:t>
-      </w:r>
-    </w:p>
-    <w:p>
-      <w:pPr>
-        <w:jc w:val="both"/>
-      </w:pPr>
-      <w:r>
-        <w:t>Tableau 1. Tableau de contingence</w:t>
-      </w:r>
-      <w:r>
-        <w:t xml:space="preserve"> *taxa* par *observateur / transect id*</w:t>
-      </w:r>
-    </w:p>
-    <w:p>
-      <w:pPr>
-        <w:jc w:val="both"/>
-      </w:pPr>
-      <w:r>
-        <w:rPr>
-          <w:noProof/>
-          <w:lang w:val="en-US"/>
+        <w:jc w:val="center"/>
+        <w:rPr>
+          <w:color w:val="000000" w:themeColor="text1"/>
+        </w:rPr>
+      </w:pPr>
+      <w:r>
+        <w:rPr>
+          <w:color w:val="000000" w:themeColor="text1"/>
+        </w:rPr>
+        <w:t>Tableau 1. Table</w:t>
+      </w:r>
+      <w:r>
+        <w:rPr>
+          <w:color w:val="000000" w:themeColor="text1"/>
+        </w:rPr>
+        <w:t xml:space="preserve"> </w:t>
+      </w:r>
+      <w:r>
+        <w:rPr>
+          <w:color w:val="000000" w:themeColor="text1"/>
+        </w:rPr>
+        <w:t>obtenue via la fonction rarecurve avec l’argument tidy=TRUE, permettant d’en faire un tableau utilisable avec ggplot.</w:t>
+      </w:r>
+    </w:p>
+    <w:p>
+      <w:pPr>
+        <w:jc w:val="center"/>
+        <w:rPr>
+          <w:color w:val="000000" w:themeColor="text1"/>
+        </w:rPr>
+      </w:pPr>
+      <w:r>
+        <w:rPr>
+          <w:color w:val="000000" w:themeColor="text1"/>
         </w:rPr>
         <w:drawing>
-          <wp:inline distT="0" distB="0" distL="0" distR="0" wp14:anchorId="1B0C091C" wp14:editId="21DF27C2">
-            <wp:extent cx="5760720" cy="2028190"/>
-            <wp:effectExtent l="0" t="0" r="0" b="0"/>
-            <wp:docPr id="1" name="Image 1"/>
+          <wp:inline distT="0" distB="0" distL="0" distR="0" wp14:anchorId="01279E21" wp14:editId="67EA071E">
+            <wp:extent cx="4143953" cy="1219370"/>
+            <wp:effectExtent l="0" t="0" r="9525" b="0"/>
+            <wp:docPr id="13" name="Image 13"/>
             <wp:cNvGraphicFramePr>
               <a:graphicFrameLocks xmlns:a="http://schemas.openxmlformats.org/drawingml/2006/main" noChangeAspect="1"/>
             </wp:cNvGraphicFramePr>
@@ -317,7 +203,7 @@
                   <pic:spPr>
                     <a:xfrm>
                       <a:off x="0" y="0"/>
-                      <a:ext cx="5760720" cy="2028190"/>
+                      <a:ext cx="4143953" cy="1219370"/>
                     </a:xfrm>
                     <a:prstGeom prst="rect">
                       <a:avLst/>
@@ -333,91 +219,42 @@
     <w:p>
       <w:pPr>
         <w:jc w:val="both"/>
-      </w:pPr>
-    </w:p>
-    <w:p>
-      <w:pPr>
-        <w:jc w:val="both"/>
-      </w:pPr>
-    </w:p>
-    <w:p>
-      <w:pPr>
-        <w:jc w:val="both"/>
-      </w:pPr>
-      <w:r>
-        <w:t>A partir de ce tableau,</w:t>
-      </w:r>
-      <w:r>
-        <w:t xml:space="preserve"> on réalise une transformation d’</w:t>
-      </w:r>
-      <w:proofErr w:type="spellStart"/>
-      <w:r>
-        <w:t>Hellinger</w:t>
-      </w:r>
-      <w:proofErr w:type="spellEnd"/>
-      <w:r>
-        <w:t xml:space="preserve"> via la fonction </w:t>
-      </w:r>
-      <w:proofErr w:type="spellStart"/>
-      <w:proofErr w:type="gramStart"/>
-      <w:r>
-        <w:t>decostand</w:t>
-      </w:r>
-      <w:proofErr w:type="spellEnd"/>
-      <w:r>
-        <w:t>(</w:t>
-      </w:r>
-      <w:proofErr w:type="gramEnd"/>
-      <w:r>
-        <w:t>) (</w:t>
-      </w:r>
-      <w:proofErr w:type="spellStart"/>
-      <w:r>
-        <w:t>vegan</w:t>
-      </w:r>
-      <w:proofErr w:type="spellEnd"/>
-      <w:r>
-        <w:t xml:space="preserve"> package), un centrage / réduction (fonction </w:t>
-      </w:r>
-      <w:proofErr w:type="spellStart"/>
-      <w:r>
-        <w:t>scale</w:t>
-      </w:r>
-      <w:proofErr w:type="spellEnd"/>
-      <w:r>
-        <w:t>()), puis</w:t>
-      </w:r>
-      <w:r>
-        <w:t xml:space="preserve"> on réalise une ACP, don</w:t>
-      </w:r>
-      <w:r>
-        <w:t>t</w:t>
-      </w:r>
-      <w:r>
-        <w:t xml:space="preserve"> le résumé des dimensions donne le tableau 2.</w:t>
-      </w:r>
-    </w:p>
-    <w:p>
-      <w:pPr>
-        <w:jc w:val="both"/>
-      </w:pPr>
-      <w:r>
-        <w:t xml:space="preserve">Tableau 2. Variabilité expliquée par l’ACP. </w:t>
-      </w:r>
-    </w:p>
-    <w:p>
-      <w:pPr>
-        <w:jc w:val="both"/>
+        <w:rPr>
+          <w:color w:val="000000" w:themeColor="text1"/>
+        </w:rPr>
+      </w:pPr>
+    </w:p>
+    <w:p>
+      <w:pPr>
+        <w:jc w:val="both"/>
+        <w:rPr>
+          <w:color w:val="000000" w:themeColor="text1"/>
+        </w:rPr>
+      </w:pPr>
+      <w:r>
+        <w:rPr>
+          <w:color w:val="000000" w:themeColor="text1"/>
+        </w:rPr>
+        <w:t>Les courbes d’accumulation des espèces en fonction du temps sont dans les figure 1 et 2.</w:t>
+      </w:r>
+    </w:p>
+    <w:p>
+      <w:pPr>
+        <w:jc w:val="center"/>
+        <w:rPr>
+          <w:color w:val="000000" w:themeColor="text1"/>
+        </w:rPr>
       </w:pPr>
       <w:r>
         <w:rPr>
           <w:noProof/>
         </w:rPr>
+        <w:lastRenderedPageBreak/>
         <w:drawing>
-          <wp:inline distT="0" distB="0" distL="0" distR="0" wp14:anchorId="67DF37C0" wp14:editId="796AC0B9">
-            <wp:extent cx="2257740" cy="1133633"/>
-            <wp:effectExtent l="0" t="0" r="9525" b="9525"/>
-            <wp:docPr id="3" name="Image 3"/>
+          <wp:inline distT="0" distB="0" distL="0" distR="0" wp14:anchorId="5C9A319B" wp14:editId="643198FD">
+            <wp:extent cx="3705225" cy="3699915"/>
+            <wp:effectExtent l="0" t="0" r="0" b="0"/>
+            <wp:docPr id="12" name="Image 12"/>
             <wp:cNvGraphicFramePr>
               <a:graphicFrameLocks xmlns:a="http://schemas.openxmlformats.org/drawingml/2006/main" noChangeAspect="1"/>
             </wp:cNvGraphicFramePr>
@@ -437,7 +274,7 @@
                   <pic:spPr>
                     <a:xfrm>
                       <a:off x="0" y="0"/>
-                      <a:ext cx="2257740" cy="1133633"/>
+                      <a:ext cx="3712986" cy="3707665"/>
                     </a:xfrm>
                     <a:prstGeom prst="rect">
                       <a:avLst/>
@@ -449,34 +286,15 @@
           </wp:inline>
         </w:drawing>
       </w:r>
-    </w:p>
-    <w:p>
-      <w:pPr>
-        <w:jc w:val="both"/>
-      </w:pPr>
-      <w:r>
-        <w:lastRenderedPageBreak/>
-        <w:t>On en tire également le cercle des corrélations pour les différents axes (figure 1.)</w:t>
-      </w:r>
-    </w:p>
-    <w:p>
-      <w:pPr>
-        <w:jc w:val="both"/>
-      </w:pPr>
-    </w:p>
-    <w:p>
-      <w:pPr>
-        <w:jc w:val="center"/>
-      </w:pPr>
       <w:r>
         <w:rPr>
           <w:noProof/>
         </w:rPr>
         <w:drawing>
-          <wp:inline distT="0" distB="0" distL="0" distR="0" wp14:anchorId="4366CD25" wp14:editId="760FF1F6">
-            <wp:extent cx="5799510" cy="5791200"/>
+          <wp:inline distT="0" distB="0" distL="0" distR="0" wp14:anchorId="568C4164" wp14:editId="3FCD6356">
+            <wp:extent cx="4044396" cy="4038600"/>
             <wp:effectExtent l="0" t="0" r="0" b="0"/>
-            <wp:docPr id="2" name="Image 2"/>
+            <wp:docPr id="11" name="Image 11"/>
             <wp:cNvGraphicFramePr>
               <a:graphicFrameLocks xmlns:a="http://schemas.openxmlformats.org/drawingml/2006/main" noChangeAspect="1"/>
             </wp:cNvGraphicFramePr>
@@ -496,7 +314,7 @@
                   <pic:spPr>
                     <a:xfrm>
                       <a:off x="0" y="0"/>
-                      <a:ext cx="5822614" cy="5814271"/>
+                      <a:ext cx="4047905" cy="4042104"/>
                     </a:xfrm>
                     <a:prstGeom prst="rect">
                       <a:avLst/>
@@ -511,34 +329,10 @@
     </w:p>
     <w:p>
       <w:pPr>
-        <w:jc w:val="both"/>
-      </w:pPr>
-      <w:r>
-        <w:t xml:space="preserve">Figure 1. Cercles des </w:t>
-      </w:r>
-      <w:proofErr w:type="spellStart"/>
-      <w:r>
-        <w:t>correlations</w:t>
-      </w:r>
-      <w:proofErr w:type="spellEnd"/>
-      <w:r>
-        <w:t xml:space="preserve"> pour l</w:t>
-      </w:r>
-      <w:r>
-        <w:t xml:space="preserve">’ACP réalisée sur le tableau 1 (à savoir, les observations via le protocole </w:t>
-      </w:r>
-      <w:proofErr w:type="spellStart"/>
-      <w:r>
-        <w:t>SoilFari</w:t>
-      </w:r>
-      <w:proofErr w:type="spellEnd"/>
-      <w:r>
-        <w:t>).</w:t>
-      </w:r>
-    </w:p>
-    <w:p>
-      <w:pPr>
         <w:jc w:val="center"/>
+        <w:rPr>
+          <w:color w:val="000000" w:themeColor="text1"/>
+        </w:rPr>
       </w:pPr>
       <w:r>
         <w:rPr>
@@ -546,10 +340,10 @@
         </w:rPr>
         <w:lastRenderedPageBreak/>
         <w:drawing>
-          <wp:inline distT="0" distB="0" distL="0" distR="0" wp14:anchorId="5E6C2536" wp14:editId="05D21459">
-            <wp:extent cx="4248150" cy="4242063"/>
-            <wp:effectExtent l="0" t="0" r="0" b="6350"/>
-            <wp:docPr id="4" name="Image 4"/>
+          <wp:inline distT="0" distB="0" distL="0" distR="0" wp14:anchorId="0D460714" wp14:editId="49E71729">
+            <wp:extent cx="4572000" cy="4565448"/>
+            <wp:effectExtent l="0" t="0" r="0" b="6985"/>
+            <wp:docPr id="7" name="Image 7"/>
             <wp:cNvGraphicFramePr>
               <a:graphicFrameLocks xmlns:a="http://schemas.openxmlformats.org/drawingml/2006/main" noChangeAspect="1"/>
             </wp:cNvGraphicFramePr>
@@ -569,6 +363,298 @@
                   <pic:spPr>
                     <a:xfrm>
                       <a:off x="0" y="0"/>
+                      <a:ext cx="4574144" cy="4567589"/>
+                    </a:xfrm>
+                    <a:prstGeom prst="rect">
+                      <a:avLst/>
+                    </a:prstGeom>
+                  </pic:spPr>
+                </pic:pic>
+              </a:graphicData>
+            </a:graphic>
+          </wp:inline>
+        </w:drawing>
+      </w:r>
+    </w:p>
+    <w:p>
+      <w:pPr>
+        <w:jc w:val="both"/>
+        <w:rPr>
+          <w:color w:val="000000" w:themeColor="text1"/>
+        </w:rPr>
+      </w:pPr>
+    </w:p>
+    <w:p>
+      <w:pPr>
+        <w:rPr>
+          <w:color w:val="000000" w:themeColor="text1"/>
+        </w:rPr>
+      </w:pPr>
+      <w:r>
+        <w:rPr>
+          <w:color w:val="000000" w:themeColor="text1"/>
+        </w:rPr>
+        <w:br w:type="page"/>
+      </w:r>
+    </w:p>
+    <w:p>
+      <w:pPr>
+        <w:jc w:val="both"/>
+        <w:rPr>
+          <w:color w:val="000000" w:themeColor="text1"/>
+        </w:rPr>
+      </w:pPr>
+      <w:r>
+        <w:rPr>
+          <w:color w:val="000000" w:themeColor="text1"/>
+        </w:rPr>
+        <w:lastRenderedPageBreak/>
+        <w:t>Enfin, une dernière partie du script s’attache aux analyses de diversité multivariées. Le tableau 1 représente une partie du tableau utilisé pour les analyses, à savoir les taxa observés par chaque personne/transect.</w:t>
+      </w:r>
+    </w:p>
+    <w:p>
+      <w:pPr>
+        <w:jc w:val="both"/>
+      </w:pPr>
+      <w:r>
+        <w:t>Tableau 1. Tableau de contingence</w:t>
+      </w:r>
+      <w:r>
+        <w:t xml:space="preserve"> *taxa* par *observateur / transect id*</w:t>
+      </w:r>
+    </w:p>
+    <w:p>
+      <w:pPr>
+        <w:jc w:val="both"/>
+      </w:pPr>
+      <w:r>
+        <w:rPr>
+          <w:noProof/>
+          <w:lang w:val="en-US"/>
+        </w:rPr>
+        <w:drawing>
+          <wp:inline distT="0" distB="0" distL="0" distR="0" wp14:anchorId="1B0C091C" wp14:editId="21DF27C2">
+            <wp:extent cx="5760720" cy="2028190"/>
+            <wp:effectExtent l="0" t="0" r="0" b="0"/>
+            <wp:docPr id="1" name="Image 1"/>
+            <wp:cNvGraphicFramePr>
+              <a:graphicFrameLocks xmlns:a="http://schemas.openxmlformats.org/drawingml/2006/main" noChangeAspect="1"/>
+            </wp:cNvGraphicFramePr>
+            <a:graphic xmlns:a="http://schemas.openxmlformats.org/drawingml/2006/main">
+              <a:graphicData uri="http://schemas.openxmlformats.org/drawingml/2006/picture">
+                <pic:pic xmlns:pic="http://schemas.openxmlformats.org/drawingml/2006/picture">
+                  <pic:nvPicPr>
+                    <pic:cNvPr id="1" name=""/>
+                    <pic:cNvPicPr/>
+                  </pic:nvPicPr>
+                  <pic:blipFill>
+                    <a:blip r:embed="rId8"/>
+                    <a:stretch>
+                      <a:fillRect/>
+                    </a:stretch>
+                  </pic:blipFill>
+                  <pic:spPr>
+                    <a:xfrm>
+                      <a:off x="0" y="0"/>
+                      <a:ext cx="5760720" cy="2028190"/>
+                    </a:xfrm>
+                    <a:prstGeom prst="rect">
+                      <a:avLst/>
+                    </a:prstGeom>
+                  </pic:spPr>
+                </pic:pic>
+              </a:graphicData>
+            </a:graphic>
+          </wp:inline>
+        </w:drawing>
+      </w:r>
+    </w:p>
+    <w:p>
+      <w:pPr>
+        <w:jc w:val="both"/>
+      </w:pPr>
+    </w:p>
+    <w:p>
+      <w:pPr>
+        <w:jc w:val="both"/>
+      </w:pPr>
+    </w:p>
+    <w:p>
+      <w:pPr>
+        <w:jc w:val="both"/>
+      </w:pPr>
+      <w:r>
+        <w:t>A partir de ce tableau,</w:t>
+      </w:r>
+      <w:r>
+        <w:t xml:space="preserve"> on réalise une transformation d’Hellinger via la fonction decostand() (vegan package), un centrage / réduction (fonction scale()), puis</w:t>
+      </w:r>
+      <w:r>
+        <w:t xml:space="preserve"> on réalise une ACP, don</w:t>
+      </w:r>
+      <w:r>
+        <w:t>t</w:t>
+      </w:r>
+      <w:r>
+        <w:t xml:space="preserve"> le résumé des dimensions donne le tableau 2.</w:t>
+      </w:r>
+    </w:p>
+    <w:p>
+      <w:pPr>
+        <w:jc w:val="center"/>
+      </w:pPr>
+      <w:r>
+        <w:t>Tableau 2. Variabilité expliquée par l’ACP.</w:t>
+      </w:r>
+    </w:p>
+    <w:p>
+      <w:pPr>
+        <w:jc w:val="center"/>
+      </w:pPr>
+      <w:r>
+        <w:rPr>
+          <w:noProof/>
+        </w:rPr>
+        <w:drawing>
+          <wp:inline distT="0" distB="0" distL="0" distR="0" wp14:anchorId="67DF37C0" wp14:editId="796AC0B9">
+            <wp:extent cx="2257740" cy="1133633"/>
+            <wp:effectExtent l="0" t="0" r="9525" b="9525"/>
+            <wp:docPr id="3" name="Image 3"/>
+            <wp:cNvGraphicFramePr>
+              <a:graphicFrameLocks xmlns:a="http://schemas.openxmlformats.org/drawingml/2006/main" noChangeAspect="1"/>
+            </wp:cNvGraphicFramePr>
+            <a:graphic xmlns:a="http://schemas.openxmlformats.org/drawingml/2006/main">
+              <a:graphicData uri="http://schemas.openxmlformats.org/drawingml/2006/picture">
+                <pic:pic xmlns:pic="http://schemas.openxmlformats.org/drawingml/2006/picture">
+                  <pic:nvPicPr>
+                    <pic:cNvPr id="1" name=""/>
+                    <pic:cNvPicPr/>
+                  </pic:nvPicPr>
+                  <pic:blipFill>
+                    <a:blip r:embed="rId9"/>
+                    <a:stretch>
+                      <a:fillRect/>
+                    </a:stretch>
+                  </pic:blipFill>
+                  <pic:spPr>
+                    <a:xfrm>
+                      <a:off x="0" y="0"/>
+                      <a:ext cx="2257740" cy="1133633"/>
+                    </a:xfrm>
+                    <a:prstGeom prst="rect">
+                      <a:avLst/>
+                    </a:prstGeom>
+                  </pic:spPr>
+                </pic:pic>
+              </a:graphicData>
+            </a:graphic>
+          </wp:inline>
+        </w:drawing>
+      </w:r>
+    </w:p>
+    <w:p>
+      <w:pPr>
+        <w:jc w:val="both"/>
+      </w:pPr>
+      <w:r>
+        <w:t>On en tire également le cercle des corrélations pour les différents axes (figure 1.)</w:t>
+      </w:r>
+    </w:p>
+    <w:p>
+      <w:pPr>
+        <w:jc w:val="both"/>
+      </w:pPr>
+    </w:p>
+    <w:p>
+      <w:pPr>
+        <w:jc w:val="center"/>
+      </w:pPr>
+      <w:r>
+        <w:rPr>
+          <w:noProof/>
+        </w:rPr>
+        <w:lastRenderedPageBreak/>
+        <w:drawing>
+          <wp:inline distT="0" distB="0" distL="0" distR="0" wp14:anchorId="4366CD25" wp14:editId="760FF1F6">
+            <wp:extent cx="5799510" cy="5791200"/>
+            <wp:effectExtent l="0" t="0" r="0" b="0"/>
+            <wp:docPr id="2" name="Image 2"/>
+            <wp:cNvGraphicFramePr>
+              <a:graphicFrameLocks xmlns:a="http://schemas.openxmlformats.org/drawingml/2006/main" noChangeAspect="1"/>
+            </wp:cNvGraphicFramePr>
+            <a:graphic xmlns:a="http://schemas.openxmlformats.org/drawingml/2006/main">
+              <a:graphicData uri="http://schemas.openxmlformats.org/drawingml/2006/picture">
+                <pic:pic xmlns:pic="http://schemas.openxmlformats.org/drawingml/2006/picture">
+                  <pic:nvPicPr>
+                    <pic:cNvPr id="1" name=""/>
+                    <pic:cNvPicPr/>
+                  </pic:nvPicPr>
+                  <pic:blipFill>
+                    <a:blip r:embed="rId10"/>
+                    <a:stretch>
+                      <a:fillRect/>
+                    </a:stretch>
+                  </pic:blipFill>
+                  <pic:spPr>
+                    <a:xfrm>
+                      <a:off x="0" y="0"/>
+                      <a:ext cx="5822614" cy="5814271"/>
+                    </a:xfrm>
+                    <a:prstGeom prst="rect">
+                      <a:avLst/>
+                    </a:prstGeom>
+                  </pic:spPr>
+                </pic:pic>
+              </a:graphicData>
+            </a:graphic>
+          </wp:inline>
+        </w:drawing>
+      </w:r>
+    </w:p>
+    <w:p>
+      <w:pPr>
+        <w:jc w:val="both"/>
+      </w:pPr>
+      <w:r>
+        <w:t>Figure 1. Cercles des correlations pour l</w:t>
+      </w:r>
+      <w:r>
+        <w:t>’ACP réalisée sur le tableau 1 (à savoir, les observations via le protocole SoilFari).</w:t>
+      </w:r>
+    </w:p>
+    <w:p>
+      <w:pPr>
+        <w:jc w:val="center"/>
+      </w:pPr>
+      <w:r>
+        <w:rPr>
+          <w:noProof/>
+        </w:rPr>
+        <w:lastRenderedPageBreak/>
+        <w:drawing>
+          <wp:inline distT="0" distB="0" distL="0" distR="0" wp14:anchorId="5E6C2536" wp14:editId="05D21459">
+            <wp:extent cx="4248150" cy="4242063"/>
+            <wp:effectExtent l="0" t="0" r="0" b="6350"/>
+            <wp:docPr id="4" name="Image 4"/>
+            <wp:cNvGraphicFramePr>
+              <a:graphicFrameLocks xmlns:a="http://schemas.openxmlformats.org/drawingml/2006/main" noChangeAspect="1"/>
+            </wp:cNvGraphicFramePr>
+            <a:graphic xmlns:a="http://schemas.openxmlformats.org/drawingml/2006/main">
+              <a:graphicData uri="http://schemas.openxmlformats.org/drawingml/2006/picture">
+                <pic:pic xmlns:pic="http://schemas.openxmlformats.org/drawingml/2006/picture">
+                  <pic:nvPicPr>
+                    <pic:cNvPr id="1" name=""/>
+                    <pic:cNvPicPr/>
+                  </pic:nvPicPr>
+                  <pic:blipFill>
+                    <a:blip r:embed="rId11"/>
+                    <a:stretch>
+                      <a:fillRect/>
+                    </a:stretch>
+                  </pic:blipFill>
+                  <pic:spPr>
+                    <a:xfrm>
+                      <a:off x="0" y="0"/>
                       <a:ext cx="4262536" cy="4256428"/>
                     </a:xfrm>
                     <a:prstGeom prst="rect">
@@ -587,13 +673,8 @@
         <w:jc w:val="center"/>
       </w:pPr>
       <w:r>
-        <w:t xml:space="preserve">Figure 2. Diagramme de Shepard pour l’ACP sur les données de </w:t>
-      </w:r>
-      <w:proofErr w:type="spellStart"/>
-      <w:r>
-        <w:t>SoilFari</w:t>
-      </w:r>
-      <w:proofErr w:type="spellEnd"/>
+        <w:t>Figure 2. Diagramme de Shepard pour l’ACP sur les données de SoilFari</w:t>
+      </w:r>
     </w:p>
     <w:p>
       <w:pPr>
@@ -604,47 +685,21 @@
           <w:b/>
           <w:bCs/>
         </w:rPr>
-        <w:t xml:space="preserve">Analyse de </w:t>
-      </w:r>
-      <w:proofErr w:type="spellStart"/>
-      <w:r>
-        <w:rPr>
-          <w:b/>
-          <w:bCs/>
-        </w:rPr>
-        <w:t>co</w:t>
-      </w:r>
-      <w:proofErr w:type="spellEnd"/>
-      <w:r>
-        <w:rPr>
-          <w:b/>
-          <w:bCs/>
-        </w:rPr>
-        <w:t>-inertie :</w:t>
-      </w:r>
-    </w:p>
-    <w:p>
-      <w:pPr>
-        <w:jc w:val="both"/>
-      </w:pPr>
-      <w:r>
-        <w:t xml:space="preserve">L’analyse d </w:t>
-      </w:r>
-      <w:proofErr w:type="spellStart"/>
-      <w:r>
-        <w:t>co</w:t>
-      </w:r>
-      <w:proofErr w:type="spellEnd"/>
-      <w:r>
-        <w:t xml:space="preserve">-inertie portant sur 2 tableaux, on va réaliser </w:t>
-      </w:r>
-      <w:proofErr w:type="gramStart"/>
-      <w:r>
-        <w:t>une deuxième ACP</w:t>
-      </w:r>
-      <w:proofErr w:type="gramEnd"/>
-      <w:r>
-        <w:t>, mais sur les données de TSBF.</w:t>
+        <w:t>Analyse de co-inertie :</w:t>
+      </w:r>
+    </w:p>
+    <w:p>
+      <w:pPr>
+        <w:jc w:val="both"/>
+      </w:pPr>
+      <w:r>
+        <w:t>L’analyse d</w:t>
+      </w:r>
+      <w:r>
+        <w:t>e</w:t>
+      </w:r>
+      <w:r>
+        <w:t xml:space="preserve"> co-inertie portant sur 2 tableaux, on va réaliser une deuxième ACP, mais sur les données de TSBF.</w:t>
       </w:r>
     </w:p>
     <w:p>
@@ -679,7 +734,7 @@
                     <pic:cNvPicPr/>
                   </pic:nvPicPr>
                   <pic:blipFill>
-                    <a:blip r:embed="rId8">
+                    <a:blip r:embed="rId12">
                       <a:extLst>
                         <a:ext uri="{28A0092B-C50C-407E-A947-70E740481C1C}">
                           <a14:useLocalDpi xmlns:a14="http://schemas.microsoft.com/office/drawing/2010/main" val="0"/>
@@ -734,7 +789,7 @@
                     <pic:cNvPicPr/>
                   </pic:nvPicPr>
                   <pic:blipFill>
-                    <a:blip r:embed="rId9"/>
+                    <a:blip r:embed="rId13"/>
                     <a:stretch>
                       <a:fillRect/>
                     </a:stretch>

</xml_diff>

<commit_message>
Rename script; add beta-diversity prep & plot
Rename SoilFari_betadiv to SoilFari_betadiv.R and add data preparation and simple plotting for beta-diversity. The R changes load the combined safari dataframe, build a site-by-species community table, convert to presence/absence, compute per-transect abundance, run a summary, and produce a basic abundance plot. Also updated the intermediate report document (binary .docx) — content changed in the manuscript file.
</commit_message>
<xml_diff>
--- a/6-manuscripts/RAPPORT INTERMéDIAIRE - 11mar2026.docx
+++ b/6-manuscripts/RAPPORT INTERMéDIAIRE - 11mar2026.docx
@@ -7,7 +7,15 @@
         <w:jc w:val="center"/>
       </w:pPr>
       <w:r>
-        <w:t xml:space="preserve">RAPPORT INTERMéDIAIRE </w:t>
+        <w:t xml:space="preserve">RAPPORT </w:t>
+      </w:r>
+      <w:proofErr w:type="spellStart"/>
+      <w:r>
+        <w:t>INTERMéDIAIRE</w:t>
+      </w:r>
+      <w:proofErr w:type="spellEnd"/>
+      <w:r>
+        <w:t xml:space="preserve"> </w:t>
       </w:r>
       <w:r>
         <w:t>– Analyses de la diversité des sols européens</w:t>
@@ -20,12 +28,22 @@
       <w:r>
         <w:t xml:space="preserve">Script principal : </w:t>
       </w:r>
+      <w:proofErr w:type="spellStart"/>
       <w:r>
         <w:rPr>
           <w:color w:val="FF0000"/>
         </w:rPr>
-        <w:t>SoilFari_script.R</w:t>
-      </w:r>
+        <w:t>SoilFari_</w:t>
+      </w:r>
+      <w:proofErr w:type="gramStart"/>
+      <w:r>
+        <w:rPr>
+          <w:color w:val="FF0000"/>
+        </w:rPr>
+        <w:t>script.R</w:t>
+      </w:r>
+      <w:proofErr w:type="spellEnd"/>
+      <w:proofErr w:type="gramEnd"/>
     </w:p>
     <w:p>
       <w:pPr>
@@ -38,13 +56,24 @@
       <w:r>
         <w:t xml:space="preserve">Script fonctions : </w:t>
       </w:r>
+      <w:proofErr w:type="spellStart"/>
       <w:r>
         <w:rPr>
           <w:color w:val="FF0000"/>
           <w:u w:val="single"/>
         </w:rPr>
-        <w:t>SoilFari_functions.R</w:t>
-      </w:r>
+        <w:t>SoilFari_</w:t>
+      </w:r>
+      <w:proofErr w:type="gramStart"/>
+      <w:r>
+        <w:rPr>
+          <w:color w:val="FF0000"/>
+          <w:u w:val="single"/>
+        </w:rPr>
+        <w:t>functions.R</w:t>
+      </w:r>
+      <w:proofErr w:type="spellEnd"/>
+      <w:proofErr w:type="gramEnd"/>
     </w:p>
     <w:p>
       <w:pPr>
@@ -59,25 +88,49 @@
         <w:rPr>
           <w:lang w:val="en-US"/>
         </w:rPr>
-        <w:t xml:space="preserve">Work directory : </w:t>
-      </w:r>
+        <w:t xml:space="preserve">Work </w:t>
+      </w:r>
+      <w:proofErr w:type="gramStart"/>
+      <w:r>
+        <w:rPr>
+          <w:lang w:val="en-US"/>
+        </w:rPr>
+        <w:t>directory :</w:t>
+      </w:r>
+      <w:proofErr w:type="gramEnd"/>
+      <w:r>
+        <w:rPr>
+          <w:lang w:val="en-US"/>
+        </w:rPr>
+        <w:t xml:space="preserve"> </w:t>
+      </w:r>
+      <w:proofErr w:type="spellStart"/>
       <w:r>
         <w:rPr>
           <w:color w:val="4472C4" w:themeColor="accent1"/>
           <w:u w:val="single"/>
           <w:lang w:val="en-US"/>
         </w:rPr>
-        <w:t>setwd('D:/GitHub/AI4SH/4-DataFrames_ready')</w:t>
-      </w:r>
-    </w:p>
-    <w:p>
-      <w:pPr>
-        <w:jc w:val="both"/>
+        <w:t>setwd</w:t>
+      </w:r>
+      <w:proofErr w:type="spellEnd"/>
+      <w:r>
         <w:rPr>
           <w:color w:val="4472C4" w:themeColor="accent1"/>
           <w:u w:val="single"/>
           <w:lang w:val="en-US"/>
         </w:rPr>
+        <w:t>('D:/GitHub/AI4SH/4-DataFrames_ready')</w:t>
+      </w:r>
+    </w:p>
+    <w:p>
+      <w:pPr>
+        <w:jc w:val="both"/>
+        <w:rPr>
+          <w:color w:val="4472C4" w:themeColor="accent1"/>
+          <w:u w:val="single"/>
+          <w:lang w:val="en-US"/>
+        </w:rPr>
       </w:pPr>
     </w:p>
     <w:p>
@@ -97,21 +150,77 @@
         <w:rPr>
           <w:color w:val="000000" w:themeColor="text1"/>
         </w:rPr>
-        <w:t xml:space="preserve"> tableaux de données : ceux pour les résultats de TSBF et ceux pour les observations faites avec la méthode SoilFari, enregistrées sur iNaturalist.</w:t>
-      </w:r>
-    </w:p>
-    <w:p>
-      <w:pPr>
-        <w:jc w:val="both"/>
-        <w:rPr>
-          <w:color w:val="000000" w:themeColor="text1"/>
-        </w:rPr>
-      </w:pPr>
-      <w:r>
-        <w:rPr>
-          <w:color w:val="000000" w:themeColor="text1"/>
-        </w:rPr>
-        <w:t>Les 150 premières ligne du script principal sont là pour charger les packages, les dataframes et process ces derniers notamment grâce au script fonctions.</w:t>
+        <w:t xml:space="preserve"> tableaux de données : ceux pour les résultats de TSBF et ceux pour les observations faites avec la méthode </w:t>
+      </w:r>
+      <w:proofErr w:type="spellStart"/>
+      <w:r>
+        <w:rPr>
+          <w:color w:val="000000" w:themeColor="text1"/>
+        </w:rPr>
+        <w:t>SoilFari</w:t>
+      </w:r>
+      <w:proofErr w:type="spellEnd"/>
+      <w:r>
+        <w:rPr>
+          <w:color w:val="000000" w:themeColor="text1"/>
+        </w:rPr>
+        <w:t xml:space="preserve">, enregistrées sur </w:t>
+      </w:r>
+      <w:proofErr w:type="spellStart"/>
+      <w:r>
+        <w:rPr>
+          <w:color w:val="000000" w:themeColor="text1"/>
+        </w:rPr>
+        <w:t>iNaturalist</w:t>
+      </w:r>
+      <w:proofErr w:type="spellEnd"/>
+      <w:r>
+        <w:rPr>
+          <w:color w:val="000000" w:themeColor="text1"/>
+        </w:rPr>
+        <w:t>.</w:t>
+      </w:r>
+    </w:p>
+    <w:p>
+      <w:pPr>
+        <w:jc w:val="both"/>
+        <w:rPr>
+          <w:color w:val="000000" w:themeColor="text1"/>
+        </w:rPr>
+      </w:pPr>
+      <w:r>
+        <w:rPr>
+          <w:color w:val="000000" w:themeColor="text1"/>
+        </w:rPr>
+        <w:t xml:space="preserve">Les 150 </w:t>
+      </w:r>
+      <w:proofErr w:type="gramStart"/>
+      <w:r>
+        <w:rPr>
+          <w:color w:val="000000" w:themeColor="text1"/>
+        </w:rPr>
+        <w:t>premières ligne</w:t>
+      </w:r>
+      <w:proofErr w:type="gramEnd"/>
+      <w:r>
+        <w:rPr>
+          <w:color w:val="000000" w:themeColor="text1"/>
+        </w:rPr>
+        <w:t xml:space="preserve"> du script principal sont là pour charger les packages, les </w:t>
+      </w:r>
+      <w:proofErr w:type="spellStart"/>
+      <w:r>
+        <w:rPr>
+          <w:color w:val="000000" w:themeColor="text1"/>
+        </w:rPr>
+        <w:t>dataframes</w:t>
+      </w:r>
+      <w:proofErr w:type="spellEnd"/>
+      <w:r>
+        <w:rPr>
+          <w:color w:val="000000" w:themeColor="text1"/>
+        </w:rPr>
+        <w:t xml:space="preserve"> et process ces derniers notamment grâce au script fonctions.</w:t>
       </w:r>
     </w:p>
     <w:p>
@@ -165,7 +274,49 @@
         <w:rPr>
           <w:color w:val="000000" w:themeColor="text1"/>
         </w:rPr>
-        <w:t>obtenue via la fonction rarecurve avec l’argument tidy=TRUE, permettant d’en faire un tableau utilisable avec ggplot.</w:t>
+        <w:t xml:space="preserve">obtenue via la fonction </w:t>
+      </w:r>
+      <w:proofErr w:type="spellStart"/>
+      <w:r>
+        <w:rPr>
+          <w:color w:val="000000" w:themeColor="text1"/>
+        </w:rPr>
+        <w:t>rarecurve</w:t>
+      </w:r>
+      <w:proofErr w:type="spellEnd"/>
+      <w:r>
+        <w:rPr>
+          <w:color w:val="000000" w:themeColor="text1"/>
+        </w:rPr>
+        <w:t xml:space="preserve"> avec l’argument </w:t>
+      </w:r>
+      <w:proofErr w:type="spellStart"/>
+      <w:r>
+        <w:rPr>
+          <w:color w:val="000000" w:themeColor="text1"/>
+        </w:rPr>
+        <w:t>tidy</w:t>
+      </w:r>
+      <w:proofErr w:type="spellEnd"/>
+      <w:r>
+        <w:rPr>
+          <w:color w:val="000000" w:themeColor="text1"/>
+        </w:rPr>
+        <w:t xml:space="preserve">=TRUE, permettant d’en faire un tableau utilisable avec </w:t>
+      </w:r>
+      <w:proofErr w:type="spellStart"/>
+      <w:r>
+        <w:rPr>
+          <w:color w:val="000000" w:themeColor="text1"/>
+        </w:rPr>
+        <w:t>ggplot</w:t>
+      </w:r>
+      <w:proofErr w:type="spellEnd"/>
+      <w:r>
+        <w:rPr>
+          <w:color w:val="000000" w:themeColor="text1"/>
+        </w:rPr>
+        <w:t>.</w:t>
       </w:r>
     </w:p>
     <w:p>
@@ -177,6 +328,7 @@
       </w:pPr>
       <w:r>
         <w:rPr>
+          <w:noProof/>
           <w:color w:val="000000" w:themeColor="text1"/>
         </w:rPr>
         <w:drawing>
@@ -231,12 +383,42 @@
           <w:color w:val="000000" w:themeColor="text1"/>
         </w:rPr>
       </w:pPr>
-      <w:r>
-        <w:rPr>
-          <w:color w:val="000000" w:themeColor="text1"/>
-        </w:rPr>
-        <w:t>Les courbes d’accumulation des espèces en fonction du temps sont dans les figure 1 et 2.</w:t>
-      </w:r>
+      <w:commentRangeStart w:id="0"/>
+      <w:r>
+        <w:rPr>
+          <w:color w:val="000000" w:themeColor="text1"/>
+        </w:rPr>
+        <w:t xml:space="preserve">Les courbes d’accumulation des espèces en fonction du temps sont dans </w:t>
+      </w:r>
+      <w:proofErr w:type="gramStart"/>
+      <w:r>
+        <w:rPr>
+          <w:color w:val="000000" w:themeColor="text1"/>
+        </w:rPr>
+        <w:t>les figure</w:t>
+      </w:r>
+      <w:proofErr w:type="gramEnd"/>
+      <w:r>
+        <w:rPr>
+          <w:color w:val="000000" w:themeColor="text1"/>
+        </w:rPr>
+        <w:t xml:space="preserve"> 1 et 2.</w:t>
+      </w:r>
+      <w:commentRangeEnd w:id="0"/>
+      <w:r>
+        <w:rPr>
+          <w:rStyle w:val="Marquedecommentaire"/>
+        </w:rPr>
+        <w:commentReference w:id="0"/>
+      </w:r>
+    </w:p>
+    <w:p>
+      <w:pPr>
+        <w:jc w:val="both"/>
+        <w:rPr>
+          <w:color w:val="000000" w:themeColor="text1"/>
+        </w:rPr>
+      </w:pPr>
     </w:p>
     <w:p>
       <w:pPr>
@@ -251,275 +433,10 @@
         </w:rPr>
         <w:lastRenderedPageBreak/>
         <w:drawing>
-          <wp:inline distT="0" distB="0" distL="0" distR="0" wp14:anchorId="5C9A319B" wp14:editId="643198FD">
-            <wp:extent cx="3705225" cy="3699915"/>
-            <wp:effectExtent l="0" t="0" r="0" b="0"/>
-            <wp:docPr id="12" name="Image 12"/>
-            <wp:cNvGraphicFramePr>
-              <a:graphicFrameLocks xmlns:a="http://schemas.openxmlformats.org/drawingml/2006/main" noChangeAspect="1"/>
-            </wp:cNvGraphicFramePr>
-            <a:graphic xmlns:a="http://schemas.openxmlformats.org/drawingml/2006/main">
-              <a:graphicData uri="http://schemas.openxmlformats.org/drawingml/2006/picture">
-                <pic:pic xmlns:pic="http://schemas.openxmlformats.org/drawingml/2006/picture">
-                  <pic:nvPicPr>
-                    <pic:cNvPr id="1" name=""/>
-                    <pic:cNvPicPr/>
-                  </pic:nvPicPr>
-                  <pic:blipFill>
-                    <a:blip r:embed="rId5"/>
-                    <a:stretch>
-                      <a:fillRect/>
-                    </a:stretch>
-                  </pic:blipFill>
-                  <pic:spPr>
-                    <a:xfrm>
-                      <a:off x="0" y="0"/>
-                      <a:ext cx="3712986" cy="3707665"/>
-                    </a:xfrm>
-                    <a:prstGeom prst="rect">
-                      <a:avLst/>
-                    </a:prstGeom>
-                  </pic:spPr>
-                </pic:pic>
-              </a:graphicData>
-            </a:graphic>
-          </wp:inline>
-        </w:drawing>
-      </w:r>
-      <w:r>
-        <w:rPr>
-          <w:noProof/>
-        </w:rPr>
-        <w:drawing>
-          <wp:inline distT="0" distB="0" distL="0" distR="0" wp14:anchorId="568C4164" wp14:editId="3FCD6356">
-            <wp:extent cx="4044396" cy="4038600"/>
-            <wp:effectExtent l="0" t="0" r="0" b="0"/>
-            <wp:docPr id="11" name="Image 11"/>
-            <wp:cNvGraphicFramePr>
-              <a:graphicFrameLocks xmlns:a="http://schemas.openxmlformats.org/drawingml/2006/main" noChangeAspect="1"/>
-            </wp:cNvGraphicFramePr>
-            <a:graphic xmlns:a="http://schemas.openxmlformats.org/drawingml/2006/main">
-              <a:graphicData uri="http://schemas.openxmlformats.org/drawingml/2006/picture">
-                <pic:pic xmlns:pic="http://schemas.openxmlformats.org/drawingml/2006/picture">
-                  <pic:nvPicPr>
-                    <pic:cNvPr id="1" name=""/>
-                    <pic:cNvPicPr/>
-                  </pic:nvPicPr>
-                  <pic:blipFill>
-                    <a:blip r:embed="rId6"/>
-                    <a:stretch>
-                      <a:fillRect/>
-                    </a:stretch>
-                  </pic:blipFill>
-                  <pic:spPr>
-                    <a:xfrm>
-                      <a:off x="0" y="0"/>
-                      <a:ext cx="4047905" cy="4042104"/>
-                    </a:xfrm>
-                    <a:prstGeom prst="rect">
-                      <a:avLst/>
-                    </a:prstGeom>
-                  </pic:spPr>
-                </pic:pic>
-              </a:graphicData>
-            </a:graphic>
-          </wp:inline>
-        </w:drawing>
-      </w:r>
-    </w:p>
-    <w:p>
-      <w:pPr>
-        <w:jc w:val="center"/>
-        <w:rPr>
-          <w:color w:val="000000" w:themeColor="text1"/>
-        </w:rPr>
-      </w:pPr>
-      <w:r>
-        <w:rPr>
-          <w:noProof/>
-        </w:rPr>
-        <w:lastRenderedPageBreak/>
-        <w:drawing>
-          <wp:inline distT="0" distB="0" distL="0" distR="0" wp14:anchorId="0D460714" wp14:editId="49E71729">
-            <wp:extent cx="4572000" cy="4565448"/>
-            <wp:effectExtent l="0" t="0" r="0" b="6985"/>
-            <wp:docPr id="7" name="Image 7"/>
-            <wp:cNvGraphicFramePr>
-              <a:graphicFrameLocks xmlns:a="http://schemas.openxmlformats.org/drawingml/2006/main" noChangeAspect="1"/>
-            </wp:cNvGraphicFramePr>
-            <a:graphic xmlns:a="http://schemas.openxmlformats.org/drawingml/2006/main">
-              <a:graphicData uri="http://schemas.openxmlformats.org/drawingml/2006/picture">
-                <pic:pic xmlns:pic="http://schemas.openxmlformats.org/drawingml/2006/picture">
-                  <pic:nvPicPr>
-                    <pic:cNvPr id="1" name=""/>
-                    <pic:cNvPicPr/>
-                  </pic:nvPicPr>
-                  <pic:blipFill>
-                    <a:blip r:embed="rId7"/>
-                    <a:stretch>
-                      <a:fillRect/>
-                    </a:stretch>
-                  </pic:blipFill>
-                  <pic:spPr>
-                    <a:xfrm>
-                      <a:off x="0" y="0"/>
-                      <a:ext cx="4574144" cy="4567589"/>
-                    </a:xfrm>
-                    <a:prstGeom prst="rect">
-                      <a:avLst/>
-                    </a:prstGeom>
-                  </pic:spPr>
-                </pic:pic>
-              </a:graphicData>
-            </a:graphic>
-          </wp:inline>
-        </w:drawing>
-      </w:r>
-    </w:p>
-    <w:p>
-      <w:pPr>
-        <w:jc w:val="both"/>
-        <w:rPr>
-          <w:color w:val="000000" w:themeColor="text1"/>
-        </w:rPr>
-      </w:pPr>
-    </w:p>
-    <w:p>
-      <w:pPr>
-        <w:rPr>
-          <w:color w:val="000000" w:themeColor="text1"/>
-        </w:rPr>
-      </w:pPr>
-      <w:r>
-        <w:rPr>
-          <w:color w:val="000000" w:themeColor="text1"/>
-        </w:rPr>
-        <w:br w:type="page"/>
-      </w:r>
-    </w:p>
-    <w:p>
-      <w:pPr>
-        <w:jc w:val="both"/>
-        <w:rPr>
-          <w:color w:val="000000" w:themeColor="text1"/>
-        </w:rPr>
-      </w:pPr>
-      <w:r>
-        <w:rPr>
-          <w:color w:val="000000" w:themeColor="text1"/>
-        </w:rPr>
-        <w:lastRenderedPageBreak/>
-        <w:t>Enfin, une dernière partie du script s’attache aux analyses de diversité multivariées. Le tableau 1 représente une partie du tableau utilisé pour les analyses, à savoir les taxa observés par chaque personne/transect.</w:t>
-      </w:r>
-    </w:p>
-    <w:p>
-      <w:pPr>
-        <w:jc w:val="both"/>
-      </w:pPr>
-      <w:r>
-        <w:t>Tableau 1. Tableau de contingence</w:t>
-      </w:r>
-      <w:r>
-        <w:t xml:space="preserve"> *taxa* par *observateur / transect id*</w:t>
-      </w:r>
-    </w:p>
-    <w:p>
-      <w:pPr>
-        <w:jc w:val="both"/>
-      </w:pPr>
-      <w:r>
-        <w:rPr>
-          <w:noProof/>
-          <w:lang w:val="en-US"/>
-        </w:rPr>
-        <w:drawing>
-          <wp:inline distT="0" distB="0" distL="0" distR="0" wp14:anchorId="1B0C091C" wp14:editId="21DF27C2">
-            <wp:extent cx="5760720" cy="2028190"/>
-            <wp:effectExtent l="0" t="0" r="0" b="0"/>
-            <wp:docPr id="1" name="Image 1"/>
-            <wp:cNvGraphicFramePr>
-              <a:graphicFrameLocks xmlns:a="http://schemas.openxmlformats.org/drawingml/2006/main" noChangeAspect="1"/>
-            </wp:cNvGraphicFramePr>
-            <a:graphic xmlns:a="http://schemas.openxmlformats.org/drawingml/2006/main">
-              <a:graphicData uri="http://schemas.openxmlformats.org/drawingml/2006/picture">
-                <pic:pic xmlns:pic="http://schemas.openxmlformats.org/drawingml/2006/picture">
-                  <pic:nvPicPr>
-                    <pic:cNvPr id="1" name=""/>
-                    <pic:cNvPicPr/>
-                  </pic:nvPicPr>
-                  <pic:blipFill>
-                    <a:blip r:embed="rId8"/>
-                    <a:stretch>
-                      <a:fillRect/>
-                    </a:stretch>
-                  </pic:blipFill>
-                  <pic:spPr>
-                    <a:xfrm>
-                      <a:off x="0" y="0"/>
-                      <a:ext cx="5760720" cy="2028190"/>
-                    </a:xfrm>
-                    <a:prstGeom prst="rect">
-                      <a:avLst/>
-                    </a:prstGeom>
-                  </pic:spPr>
-                </pic:pic>
-              </a:graphicData>
-            </a:graphic>
-          </wp:inline>
-        </w:drawing>
-      </w:r>
-    </w:p>
-    <w:p>
-      <w:pPr>
-        <w:jc w:val="both"/>
-      </w:pPr>
-    </w:p>
-    <w:p>
-      <w:pPr>
-        <w:jc w:val="both"/>
-      </w:pPr>
-    </w:p>
-    <w:p>
-      <w:pPr>
-        <w:jc w:val="both"/>
-      </w:pPr>
-      <w:r>
-        <w:t>A partir de ce tableau,</w:t>
-      </w:r>
-      <w:r>
-        <w:t xml:space="preserve"> on réalise une transformation d’Hellinger via la fonction decostand() (vegan package), un centrage / réduction (fonction scale()), puis</w:t>
-      </w:r>
-      <w:r>
-        <w:t xml:space="preserve"> on réalise une ACP, don</w:t>
-      </w:r>
-      <w:r>
-        <w:t>t</w:t>
-      </w:r>
-      <w:r>
-        <w:t xml:space="preserve"> le résumé des dimensions donne le tableau 2.</w:t>
-      </w:r>
-    </w:p>
-    <w:p>
-      <w:pPr>
-        <w:jc w:val="center"/>
-      </w:pPr>
-      <w:r>
-        <w:t>Tableau 2. Variabilité expliquée par l’ACP.</w:t>
-      </w:r>
-    </w:p>
-    <w:p>
-      <w:pPr>
-        <w:jc w:val="center"/>
-      </w:pPr>
-      <w:r>
-        <w:rPr>
-          <w:noProof/>
-        </w:rPr>
-        <w:drawing>
-          <wp:inline distT="0" distB="0" distL="0" distR="0" wp14:anchorId="67DF37C0" wp14:editId="796AC0B9">
-            <wp:extent cx="2257740" cy="1133633"/>
-            <wp:effectExtent l="0" t="0" r="9525" b="9525"/>
-            <wp:docPr id="3" name="Image 3"/>
+          <wp:inline distT="0" distB="0" distL="0" distR="0" wp14:anchorId="01C4E19B" wp14:editId="389B639D">
+            <wp:extent cx="5760720" cy="3482340"/>
+            <wp:effectExtent l="0" t="0" r="0" b="3810"/>
+            <wp:docPr id="8" name="Image 8"/>
             <wp:cNvGraphicFramePr>
               <a:graphicFrameLocks xmlns:a="http://schemas.openxmlformats.org/drawingml/2006/main" noChangeAspect="1"/>
             </wp:cNvGraphicFramePr>
@@ -539,7 +456,7 @@
                   <pic:spPr>
                     <a:xfrm>
                       <a:off x="0" y="0"/>
-                      <a:ext cx="2257740" cy="1133633"/>
+                      <a:ext cx="5760720" cy="3482340"/>
                     </a:xfrm>
                     <a:prstGeom prst="rect">
                       <a:avLst/>
@@ -551,34 +468,15 @@
           </wp:inline>
         </w:drawing>
       </w:r>
-    </w:p>
-    <w:p>
-      <w:pPr>
-        <w:jc w:val="both"/>
-      </w:pPr>
-      <w:r>
-        <w:t>On en tire également le cercle des corrélations pour les différents axes (figure 1.)</w:t>
-      </w:r>
-    </w:p>
-    <w:p>
-      <w:pPr>
-        <w:jc w:val="both"/>
-      </w:pPr>
-    </w:p>
-    <w:p>
-      <w:pPr>
-        <w:jc w:val="center"/>
-      </w:pPr>
       <w:r>
         <w:rPr>
           <w:noProof/>
         </w:rPr>
-        <w:lastRenderedPageBreak/>
         <w:drawing>
-          <wp:inline distT="0" distB="0" distL="0" distR="0" wp14:anchorId="4366CD25" wp14:editId="760FF1F6">
-            <wp:extent cx="5799510" cy="5791200"/>
+          <wp:inline distT="0" distB="0" distL="0" distR="0" wp14:anchorId="568C4164" wp14:editId="3CF17405">
+            <wp:extent cx="4044396" cy="4038600"/>
             <wp:effectExtent l="0" t="0" r="0" b="0"/>
-            <wp:docPr id="2" name="Image 2"/>
+            <wp:docPr id="11" name="Image 11"/>
             <wp:cNvGraphicFramePr>
               <a:graphicFrameLocks xmlns:a="http://schemas.openxmlformats.org/drawingml/2006/main" noChangeAspect="1"/>
             </wp:cNvGraphicFramePr>
@@ -598,7 +496,7 @@
                   <pic:spPr>
                     <a:xfrm>
                       <a:off x="0" y="0"/>
-                      <a:ext cx="5822614" cy="5814271"/>
+                      <a:ext cx="4047905" cy="4042104"/>
                     </a:xfrm>
                     <a:prstGeom prst="rect">
                       <a:avLst/>
@@ -613,18 +511,10 @@
     </w:p>
     <w:p>
       <w:pPr>
-        <w:jc w:val="both"/>
-      </w:pPr>
-      <w:r>
-        <w:t>Figure 1. Cercles des correlations pour l</w:t>
-      </w:r>
-      <w:r>
-        <w:t>’ACP réalisée sur le tableau 1 (à savoir, les observations via le protocole SoilFari).</w:t>
-      </w:r>
-    </w:p>
-    <w:p>
-      <w:pPr>
         <w:jc w:val="center"/>
+        <w:rPr>
+          <w:color w:val="000000" w:themeColor="text1"/>
+        </w:rPr>
       </w:pPr>
       <w:r>
         <w:rPr>
@@ -632,10 +522,10 @@
         </w:rPr>
         <w:lastRenderedPageBreak/>
         <w:drawing>
-          <wp:inline distT="0" distB="0" distL="0" distR="0" wp14:anchorId="5E6C2536" wp14:editId="05D21459">
-            <wp:extent cx="4248150" cy="4242063"/>
-            <wp:effectExtent l="0" t="0" r="0" b="6350"/>
-            <wp:docPr id="4" name="Image 4"/>
+          <wp:inline distT="0" distB="0" distL="0" distR="0" wp14:anchorId="0D460714" wp14:editId="49E71729">
+            <wp:extent cx="4572000" cy="4565448"/>
+            <wp:effectExtent l="0" t="0" r="0" b="6985"/>
+            <wp:docPr id="7" name="Image 7"/>
             <wp:cNvGraphicFramePr>
               <a:graphicFrameLocks xmlns:a="http://schemas.openxmlformats.org/drawingml/2006/main" noChangeAspect="1"/>
             </wp:cNvGraphicFramePr>
@@ -655,6 +545,351 @@
                   <pic:spPr>
                     <a:xfrm>
                       <a:off x="0" y="0"/>
+                      <a:ext cx="4574144" cy="4567589"/>
+                    </a:xfrm>
+                    <a:prstGeom prst="rect">
+                      <a:avLst/>
+                    </a:prstGeom>
+                  </pic:spPr>
+                </pic:pic>
+              </a:graphicData>
+            </a:graphic>
+          </wp:inline>
+        </w:drawing>
+      </w:r>
+    </w:p>
+    <w:p>
+      <w:pPr>
+        <w:jc w:val="both"/>
+        <w:rPr>
+          <w:color w:val="000000" w:themeColor="text1"/>
+        </w:rPr>
+      </w:pPr>
+    </w:p>
+    <w:p>
+      <w:pPr>
+        <w:rPr>
+          <w:color w:val="000000" w:themeColor="text1"/>
+        </w:rPr>
+      </w:pPr>
+      <w:r>
+        <w:rPr>
+          <w:color w:val="000000" w:themeColor="text1"/>
+        </w:rPr>
+        <w:br w:type="page"/>
+      </w:r>
+    </w:p>
+    <w:p>
+      <w:pPr>
+        <w:jc w:val="both"/>
+        <w:rPr>
+          <w:color w:val="000000" w:themeColor="text1"/>
+        </w:rPr>
+      </w:pPr>
+      <w:r>
+        <w:rPr>
+          <w:color w:val="000000" w:themeColor="text1"/>
+        </w:rPr>
+        <w:lastRenderedPageBreak/>
+        <w:t>Enfin, une dernière partie du script s’attache aux analyses de diversité multivariées. Le tableau 1 représente une partie du tableau utilisé pour les analyses, à savoir les taxa observés par chaque personne/transect.</w:t>
+      </w:r>
+    </w:p>
+    <w:p>
+      <w:pPr>
+        <w:jc w:val="both"/>
+      </w:pPr>
+      <w:r>
+        <w:t>Tableau 1. Tableau de contingence</w:t>
+      </w:r>
+      <w:r>
+        <w:t xml:space="preserve"> *taxa* par *observateur / transect id*</w:t>
+      </w:r>
+    </w:p>
+    <w:p>
+      <w:pPr>
+        <w:jc w:val="both"/>
+      </w:pPr>
+      <w:r>
+        <w:rPr>
+          <w:noProof/>
+          <w:lang w:val="en-US"/>
+        </w:rPr>
+        <w:drawing>
+          <wp:inline distT="0" distB="0" distL="0" distR="0" wp14:anchorId="1B0C091C" wp14:editId="21DF27C2">
+            <wp:extent cx="5760720" cy="2028190"/>
+            <wp:effectExtent l="0" t="0" r="0" b="0"/>
+            <wp:docPr id="1" name="Image 1"/>
+            <wp:cNvGraphicFramePr>
+              <a:graphicFrameLocks xmlns:a="http://schemas.openxmlformats.org/drawingml/2006/main" noChangeAspect="1"/>
+            </wp:cNvGraphicFramePr>
+            <a:graphic xmlns:a="http://schemas.openxmlformats.org/drawingml/2006/main">
+              <a:graphicData uri="http://schemas.openxmlformats.org/drawingml/2006/picture">
+                <pic:pic xmlns:pic="http://schemas.openxmlformats.org/drawingml/2006/picture">
+                  <pic:nvPicPr>
+                    <pic:cNvPr id="1" name=""/>
+                    <pic:cNvPicPr/>
+                  </pic:nvPicPr>
+                  <pic:blipFill>
+                    <a:blip r:embed="rId12"/>
+                    <a:stretch>
+                      <a:fillRect/>
+                    </a:stretch>
+                  </pic:blipFill>
+                  <pic:spPr>
+                    <a:xfrm>
+                      <a:off x="0" y="0"/>
+                      <a:ext cx="5760720" cy="2028190"/>
+                    </a:xfrm>
+                    <a:prstGeom prst="rect">
+                      <a:avLst/>
+                    </a:prstGeom>
+                  </pic:spPr>
+                </pic:pic>
+              </a:graphicData>
+            </a:graphic>
+          </wp:inline>
+        </w:drawing>
+      </w:r>
+    </w:p>
+    <w:p>
+      <w:pPr>
+        <w:jc w:val="both"/>
+      </w:pPr>
+    </w:p>
+    <w:p>
+      <w:pPr>
+        <w:jc w:val="both"/>
+      </w:pPr>
+    </w:p>
+    <w:p>
+      <w:pPr>
+        <w:jc w:val="both"/>
+      </w:pPr>
+      <w:r>
+        <w:t>A partir de ce tableau,</w:t>
+      </w:r>
+      <w:r>
+        <w:t xml:space="preserve"> on réalise une transformation d’</w:t>
+      </w:r>
+      <w:proofErr w:type="spellStart"/>
+      <w:r>
+        <w:t>Hellinger</w:t>
+      </w:r>
+      <w:proofErr w:type="spellEnd"/>
+      <w:r>
+        <w:t xml:space="preserve"> via la fonction </w:t>
+      </w:r>
+      <w:proofErr w:type="spellStart"/>
+      <w:proofErr w:type="gramStart"/>
+      <w:r>
+        <w:t>decostand</w:t>
+      </w:r>
+      <w:proofErr w:type="spellEnd"/>
+      <w:r>
+        <w:t>(</w:t>
+      </w:r>
+      <w:proofErr w:type="gramEnd"/>
+      <w:r>
+        <w:t>) (</w:t>
+      </w:r>
+      <w:proofErr w:type="spellStart"/>
+      <w:r>
+        <w:t>vegan</w:t>
+      </w:r>
+      <w:proofErr w:type="spellEnd"/>
+      <w:r>
+        <w:t xml:space="preserve"> package), un centrage / réduction (fonction </w:t>
+      </w:r>
+      <w:proofErr w:type="spellStart"/>
+      <w:r>
+        <w:t>scale</w:t>
+      </w:r>
+      <w:proofErr w:type="spellEnd"/>
+      <w:r>
+        <w:t>()), puis</w:t>
+      </w:r>
+      <w:r>
+        <w:t xml:space="preserve"> on réalise une ACP, don</w:t>
+      </w:r>
+      <w:r>
+        <w:t>t</w:t>
+      </w:r>
+      <w:r>
+        <w:t xml:space="preserve"> le résumé des dimensions donne le tableau 2.</w:t>
+      </w:r>
+    </w:p>
+    <w:p>
+      <w:pPr>
+        <w:jc w:val="center"/>
+      </w:pPr>
+      <w:r>
+        <w:t>Tableau 2. Variabilité expliquée par l’ACP.</w:t>
+      </w:r>
+    </w:p>
+    <w:p>
+      <w:pPr>
+        <w:jc w:val="center"/>
+      </w:pPr>
+      <w:r>
+        <w:rPr>
+          <w:noProof/>
+        </w:rPr>
+        <w:drawing>
+          <wp:inline distT="0" distB="0" distL="0" distR="0" wp14:anchorId="67DF37C0" wp14:editId="796AC0B9">
+            <wp:extent cx="2257740" cy="1133633"/>
+            <wp:effectExtent l="0" t="0" r="9525" b="9525"/>
+            <wp:docPr id="3" name="Image 3"/>
+            <wp:cNvGraphicFramePr>
+              <a:graphicFrameLocks xmlns:a="http://schemas.openxmlformats.org/drawingml/2006/main" noChangeAspect="1"/>
+            </wp:cNvGraphicFramePr>
+            <a:graphic xmlns:a="http://schemas.openxmlformats.org/drawingml/2006/main">
+              <a:graphicData uri="http://schemas.openxmlformats.org/drawingml/2006/picture">
+                <pic:pic xmlns:pic="http://schemas.openxmlformats.org/drawingml/2006/picture">
+                  <pic:nvPicPr>
+                    <pic:cNvPr id="1" name=""/>
+                    <pic:cNvPicPr/>
+                  </pic:nvPicPr>
+                  <pic:blipFill>
+                    <a:blip r:embed="rId13"/>
+                    <a:stretch>
+                      <a:fillRect/>
+                    </a:stretch>
+                  </pic:blipFill>
+                  <pic:spPr>
+                    <a:xfrm>
+                      <a:off x="0" y="0"/>
+                      <a:ext cx="2257740" cy="1133633"/>
+                    </a:xfrm>
+                    <a:prstGeom prst="rect">
+                      <a:avLst/>
+                    </a:prstGeom>
+                  </pic:spPr>
+                </pic:pic>
+              </a:graphicData>
+            </a:graphic>
+          </wp:inline>
+        </w:drawing>
+      </w:r>
+    </w:p>
+    <w:p>
+      <w:pPr>
+        <w:jc w:val="both"/>
+      </w:pPr>
+      <w:r>
+        <w:t>On en tire également le cercle des corrélations pour les différents axes (figure 1.)</w:t>
+      </w:r>
+    </w:p>
+    <w:p>
+      <w:pPr>
+        <w:jc w:val="both"/>
+      </w:pPr>
+    </w:p>
+    <w:p>
+      <w:pPr>
+        <w:jc w:val="center"/>
+      </w:pPr>
+      <w:r>
+        <w:rPr>
+          <w:noProof/>
+        </w:rPr>
+        <w:lastRenderedPageBreak/>
+        <w:drawing>
+          <wp:inline distT="0" distB="0" distL="0" distR="0" wp14:anchorId="4366CD25" wp14:editId="760FF1F6">
+            <wp:extent cx="5799510" cy="5791200"/>
+            <wp:effectExtent l="0" t="0" r="0" b="0"/>
+            <wp:docPr id="2" name="Image 2"/>
+            <wp:cNvGraphicFramePr>
+              <a:graphicFrameLocks xmlns:a="http://schemas.openxmlformats.org/drawingml/2006/main" noChangeAspect="1"/>
+            </wp:cNvGraphicFramePr>
+            <a:graphic xmlns:a="http://schemas.openxmlformats.org/drawingml/2006/main">
+              <a:graphicData uri="http://schemas.openxmlformats.org/drawingml/2006/picture">
+                <pic:pic xmlns:pic="http://schemas.openxmlformats.org/drawingml/2006/picture">
+                  <pic:nvPicPr>
+                    <pic:cNvPr id="1" name=""/>
+                    <pic:cNvPicPr/>
+                  </pic:nvPicPr>
+                  <pic:blipFill>
+                    <a:blip r:embed="rId14"/>
+                    <a:stretch>
+                      <a:fillRect/>
+                    </a:stretch>
+                  </pic:blipFill>
+                  <pic:spPr>
+                    <a:xfrm>
+                      <a:off x="0" y="0"/>
+                      <a:ext cx="5822614" cy="5814271"/>
+                    </a:xfrm>
+                    <a:prstGeom prst="rect">
+                      <a:avLst/>
+                    </a:prstGeom>
+                  </pic:spPr>
+                </pic:pic>
+              </a:graphicData>
+            </a:graphic>
+          </wp:inline>
+        </w:drawing>
+      </w:r>
+    </w:p>
+    <w:p>
+      <w:pPr>
+        <w:jc w:val="both"/>
+      </w:pPr>
+      <w:r>
+        <w:t xml:space="preserve">Figure 1. Cercles des </w:t>
+      </w:r>
+      <w:proofErr w:type="spellStart"/>
+      <w:r>
+        <w:t>correlations</w:t>
+      </w:r>
+      <w:proofErr w:type="spellEnd"/>
+      <w:r>
+        <w:t xml:space="preserve"> pour l</w:t>
+      </w:r>
+      <w:r>
+        <w:t xml:space="preserve">’ACP réalisée sur le tableau 1 (à savoir, les observations via le protocole </w:t>
+      </w:r>
+      <w:proofErr w:type="spellStart"/>
+      <w:r>
+        <w:t>SoilFari</w:t>
+      </w:r>
+      <w:proofErr w:type="spellEnd"/>
+      <w:r>
+        <w:t>).</w:t>
+      </w:r>
+    </w:p>
+    <w:p>
+      <w:pPr>
+        <w:jc w:val="center"/>
+      </w:pPr>
+      <w:r>
+        <w:rPr>
+          <w:noProof/>
+        </w:rPr>
+        <w:lastRenderedPageBreak/>
+        <w:drawing>
+          <wp:inline distT="0" distB="0" distL="0" distR="0" wp14:anchorId="5E6C2536" wp14:editId="05D21459">
+            <wp:extent cx="4248150" cy="4242063"/>
+            <wp:effectExtent l="0" t="0" r="0" b="6350"/>
+            <wp:docPr id="4" name="Image 4"/>
+            <wp:cNvGraphicFramePr>
+              <a:graphicFrameLocks xmlns:a="http://schemas.openxmlformats.org/drawingml/2006/main" noChangeAspect="1"/>
+            </wp:cNvGraphicFramePr>
+            <a:graphic xmlns:a="http://schemas.openxmlformats.org/drawingml/2006/main">
+              <a:graphicData uri="http://schemas.openxmlformats.org/drawingml/2006/picture">
+                <pic:pic xmlns:pic="http://schemas.openxmlformats.org/drawingml/2006/picture">
+                  <pic:nvPicPr>
+                    <pic:cNvPr id="1" name=""/>
+                    <pic:cNvPicPr/>
+                  </pic:nvPicPr>
+                  <pic:blipFill>
+                    <a:blip r:embed="rId15"/>
+                    <a:stretch>
+                      <a:fillRect/>
+                    </a:stretch>
+                  </pic:blipFill>
+                  <pic:spPr>
+                    <a:xfrm>
+                      <a:off x="0" y="0"/>
                       <a:ext cx="4262536" cy="4256428"/>
                     </a:xfrm>
                     <a:prstGeom prst="rect">
@@ -673,8 +908,13 @@
         <w:jc w:val="center"/>
       </w:pPr>
       <w:r>
-        <w:t>Figure 2. Diagramme de Shepard pour l’ACP sur les données de SoilFari</w:t>
-      </w:r>
+        <w:t xml:space="preserve">Figure 2. Diagramme de Shepard pour l’ACP sur les données de </w:t>
+      </w:r>
+      <w:proofErr w:type="spellStart"/>
+      <w:r>
+        <w:t>SoilFari</w:t>
+      </w:r>
+      <w:proofErr w:type="spellEnd"/>
     </w:p>
     <w:p>
       <w:pPr>
@@ -685,7 +925,23 @@
           <w:b/>
           <w:bCs/>
         </w:rPr>
-        <w:t>Analyse de co-inertie :</w:t>
+        <w:t xml:space="preserve">Analyse de </w:t>
+      </w:r>
+      <w:proofErr w:type="spellStart"/>
+      <w:r>
+        <w:rPr>
+          <w:b/>
+          <w:bCs/>
+        </w:rPr>
+        <w:t>co</w:t>
+      </w:r>
+      <w:proofErr w:type="spellEnd"/>
+      <w:r>
+        <w:rPr>
+          <w:b/>
+          <w:bCs/>
+        </w:rPr>
+        <w:t>-inertie :</w:t>
       </w:r>
     </w:p>
     <w:p>
@@ -699,7 +955,23 @@
         <w:t>e</w:t>
       </w:r>
       <w:r>
-        <w:t xml:space="preserve"> co-inertie portant sur 2 tableaux, on va réaliser une deuxième ACP, mais sur les données de TSBF.</w:t>
+        <w:t xml:space="preserve"> </w:t>
+      </w:r>
+      <w:proofErr w:type="spellStart"/>
+      <w:r>
+        <w:t>co</w:t>
+      </w:r>
+      <w:proofErr w:type="spellEnd"/>
+      <w:r>
+        <w:t xml:space="preserve">-inertie portant sur 2 tableaux, on va réaliser </w:t>
+      </w:r>
+      <w:proofErr w:type="gramStart"/>
+      <w:r>
+        <w:t>une deuxième ACP</w:t>
+      </w:r>
+      <w:proofErr w:type="gramEnd"/>
+      <w:r>
+        <w:t>, mais sur les données de TSBF.</w:t>
       </w:r>
     </w:p>
     <w:p>
@@ -734,7 +1006,7 @@
                     <pic:cNvPicPr/>
                   </pic:nvPicPr>
                   <pic:blipFill>
-                    <a:blip r:embed="rId12">
+                    <a:blip r:embed="rId16">
                       <a:extLst>
                         <a:ext uri="{28A0092B-C50C-407E-A947-70E740481C1C}">
                           <a14:useLocalDpi xmlns:a14="http://schemas.microsoft.com/office/drawing/2010/main" val="0"/>
@@ -789,7 +1061,7 @@
                     <pic:cNvPicPr/>
                   </pic:nvPicPr>
                   <pic:blipFill>
-                    <a:blip r:embed="rId13"/>
+                    <a:blip r:embed="rId17"/>
                     <a:stretch>
                       <a:fillRect/>
                     </a:stretch>
@@ -836,6 +1108,61 @@
     </w:sectPr>
   </w:body>
 </w:document>
+</file>
+
+<file path=word/comments.xml><?xml version="1.0" encoding="utf-8"?>
+<w:comments xmlns:wpc="http://schemas.microsoft.com/office/word/2010/wordprocessingCanvas" xmlns:cx="http://schemas.microsoft.com/office/drawing/2014/chartex" xmlns:cx1="http://schemas.microsoft.com/office/drawing/2015/9/8/chartex" xmlns:cx2="http://schemas.microsoft.com/office/drawing/2015/10/21/chartex" xmlns:cx3="http://schemas.microsoft.com/office/drawing/2016/5/9/chartex" xmlns:cx4="http://schemas.microsoft.com/office/drawing/2016/5/10/chartex" xmlns:cx5="http://schemas.microsoft.com/office/drawing/2016/5/11/chartex" xmlns:cx6="http://schemas.microsoft.com/office/drawing/2016/5/12/chartex" xmlns:cx7="http://schemas.microsoft.com/office/drawing/2016/5/13/chartex" xmlns:cx8="http://schemas.microsoft.com/office/drawing/2016/5/14/chartex" xmlns:mc="http://schemas.openxmlformats.org/markup-compatibility/2006" xmlns:aink="http://schemas.microsoft.com/office/drawing/2016/ink" xmlns:am3d="http://schemas.microsoft.com/office/drawing/2017/model3d" xmlns:o="urn:schemas-microsoft-com:office:office" xmlns:r="http://schemas.openxmlformats.org/officeDocument/2006/relationships" xmlns:m="http://schemas.openxmlformats.org/officeDocument/2006/math" xmlns:v="urn:schemas-microsoft-com:vml" xmlns:wp14="http://schemas.microsoft.com/office/word/2010/wordprocessingDrawing" xmlns:wp="http://schemas.openxmlformats.org/drawingml/2006/wordprocessingDrawing" xmlns:w10="urn:schemas-microsoft-com:office:word" xmlns:w="http://schemas.openxmlformats.org/wordprocessingml/2006/main" xmlns:w14="http://schemas.microsoft.com/office/word/2010/wordml" xmlns:w15="http://schemas.microsoft.com/office/word/2012/wordml" xmlns:w16cex="http://schemas.microsoft.com/office/word/2018/wordml/cex" xmlns:w16cid="http://schemas.microsoft.com/office/word/2016/wordml/cid" xmlns:w16="http://schemas.microsoft.com/office/word/2018/wordml" xmlns:w16sdtdh="http://schemas.microsoft.com/office/word/2020/wordml/sdtdatahash" xmlns:w16se="http://schemas.microsoft.com/office/word/2015/wordml/symex" xmlns:wpg="http://schemas.microsoft.com/office/word/2010/wordprocessingGroup" xmlns:wpi="http://schemas.microsoft.com/office/word/2010/wordprocessingInk" xmlns:wne="http://schemas.microsoft.com/office/word/2006/wordml" xmlns:wps="http://schemas.microsoft.com/office/word/2010/wordprocessingShape" mc:Ignorable="w14 w15 w16se w16cid w16 w16cex w16sdtdh wp14">
+  <w:comment w:id="0" w:author="Alexis PRETAT" w:date="2026-03-12T14:12:00Z" w:initials="AP">
+    <w:p>
+      <w:pPr>
+        <w:pStyle w:val="Commentaire"/>
+      </w:pPr>
+      <w:r>
+        <w:rPr>
+          <w:rStyle w:val="Marquedecommentaire"/>
+        </w:rPr>
+        <w:annotationRef/>
+      </w:r>
+      <w:r>
+        <w:t xml:space="preserve">Peut-être regarder aussi le nombre d’individus </w:t>
+      </w:r>
+      <w:proofErr w:type="spellStart"/>
+      <w:r>
+        <w:t>samplés</w:t>
+      </w:r>
+      <w:proofErr w:type="spellEnd"/>
+      <w:r>
+        <w:t xml:space="preserve"> en fonction du temps pour estimer l’effort d’échantillonnage.</w:t>
+      </w:r>
+    </w:p>
+  </w:comment>
+</w:comments>
+</file>
+
+<file path=word/commentsExtended.xml><?xml version="1.0" encoding="utf-8"?>
+<w15:commentsEx xmlns:wpc="http://schemas.microsoft.com/office/word/2010/wordprocessingCanvas" xmlns:cx="http://schemas.microsoft.com/office/drawing/2014/chartex" xmlns:cx1="http://schemas.microsoft.com/office/drawing/2015/9/8/chartex" xmlns:cx2="http://schemas.microsoft.com/office/drawing/2015/10/21/chartex" xmlns:cx3="http://schemas.microsoft.com/office/drawing/2016/5/9/chartex" xmlns:cx4="http://schemas.microsoft.com/office/drawing/2016/5/10/chartex" xmlns:cx5="http://schemas.microsoft.com/office/drawing/2016/5/11/chartex" xmlns:cx6="http://schemas.microsoft.com/office/drawing/2016/5/12/chartex" xmlns:cx7="http://schemas.microsoft.com/office/drawing/2016/5/13/chartex" xmlns:cx8="http://schemas.microsoft.com/office/drawing/2016/5/14/chartex" xmlns:mc="http://schemas.openxmlformats.org/markup-compatibility/2006" xmlns:aink="http://schemas.microsoft.com/office/drawing/2016/ink" xmlns:am3d="http://schemas.microsoft.com/office/drawing/2017/model3d" xmlns:o="urn:schemas-microsoft-com:office:office" xmlns:r="http://schemas.openxmlformats.org/officeDocument/2006/relationships" xmlns:m="http://schemas.openxmlformats.org/officeDocument/2006/math" xmlns:v="urn:schemas-microsoft-com:vml" xmlns:wp14="http://schemas.microsoft.com/office/word/2010/wordprocessingDrawing" xmlns:wp="http://schemas.openxmlformats.org/drawingml/2006/wordprocessingDrawing" xmlns:w10="urn:schemas-microsoft-com:office:word" xmlns:w="http://schemas.openxmlformats.org/wordprocessingml/2006/main" xmlns:w14="http://schemas.microsoft.com/office/word/2010/wordml" xmlns:w15="http://schemas.microsoft.com/office/word/2012/wordml" xmlns:w16cex="http://schemas.microsoft.com/office/word/2018/wordml/cex" xmlns:w16cid="http://schemas.microsoft.com/office/word/2016/wordml/cid" xmlns:w16="http://schemas.microsoft.com/office/word/2018/wordml" xmlns:w16sdtdh="http://schemas.microsoft.com/office/word/2020/wordml/sdtdatahash" xmlns:w16se="http://schemas.microsoft.com/office/word/2015/wordml/symex" xmlns:wpg="http://schemas.microsoft.com/office/word/2010/wordprocessingGroup" xmlns:wpi="http://schemas.microsoft.com/office/word/2010/wordprocessingInk" xmlns:wne="http://schemas.microsoft.com/office/word/2006/wordml" xmlns:wps="http://schemas.microsoft.com/office/word/2010/wordprocessingShape" mc:Ignorable="w14 w15 w16se w16cid w16 w16cex w16sdtdh wp14">
+  <w15:commentEx w15:paraId="36D0E36C" w15:done="0"/>
+</w15:commentsEx>
+</file>
+
+<file path=word/commentsExtensible.xml><?xml version="1.0" encoding="utf-8"?>
+<w16cex:commentsExtensible xmlns:wpc="http://schemas.microsoft.com/office/word/2010/wordprocessingCanvas" xmlns:cx="http://schemas.microsoft.com/office/drawing/2014/chartex" xmlns:cx1="http://schemas.microsoft.com/office/drawing/2015/9/8/chartex" xmlns:cx2="http://schemas.microsoft.com/office/drawing/2015/10/21/chartex" xmlns:cx3="http://schemas.microsoft.com/office/drawing/2016/5/9/chartex" xmlns:cx4="http://schemas.microsoft.com/office/drawing/2016/5/10/chartex" xmlns:cx5="http://schemas.microsoft.com/office/drawing/2016/5/11/chartex" xmlns:cx6="http://schemas.microsoft.com/office/drawing/2016/5/12/chartex" xmlns:cx7="http://schemas.microsoft.com/office/drawing/2016/5/13/chartex" xmlns:cx8="http://schemas.microsoft.com/office/drawing/2016/5/14/chartex" xmlns:mc="http://schemas.openxmlformats.org/markup-compatibility/2006" xmlns:aink="http://schemas.microsoft.com/office/drawing/2016/ink" xmlns:am3d="http://schemas.microsoft.com/office/drawing/2017/model3d" xmlns:o="urn:schemas-microsoft-com:office:office" xmlns:r="http://schemas.openxmlformats.org/officeDocument/2006/relationships" xmlns:m="http://schemas.openxmlformats.org/officeDocument/2006/math" xmlns:v="urn:schemas-microsoft-com:vml" xmlns:wp14="http://schemas.microsoft.com/office/word/2010/wordprocessingDrawing" xmlns:wp="http://schemas.openxmlformats.org/drawingml/2006/wordprocessingDrawing" xmlns:w10="urn:schemas-microsoft-com:office:word" xmlns:w="http://schemas.openxmlformats.org/wordprocessingml/2006/main" xmlns:w14="http://schemas.microsoft.com/office/word/2010/wordml" xmlns:w15="http://schemas.microsoft.com/office/word/2012/wordml" xmlns:w16cex="http://schemas.microsoft.com/office/word/2018/wordml/cex" xmlns:w16cid="http://schemas.microsoft.com/office/word/2016/wordml/cid" xmlns:w16="http://schemas.microsoft.com/office/word/2018/wordml" xmlns:w16sdtdh="http://schemas.microsoft.com/office/word/2020/wordml/sdtdatahash" xmlns:w16se="http://schemas.microsoft.com/office/word/2015/wordml/symex" xmlns:wpg="http://schemas.microsoft.com/office/word/2010/wordprocessingGroup" xmlns:wpi="http://schemas.microsoft.com/office/word/2010/wordprocessingInk" xmlns:wne="http://schemas.microsoft.com/office/word/2006/wordml" xmlns:wps="http://schemas.microsoft.com/office/word/2010/wordprocessingShape" mc:Ignorable="w14 w15 w16se w16cid w16 w16cex w16sdtdh wp14">
+  <w16cex:commentExtensible w16cex:durableId="2D5D4838" w16cex:dateUtc="2026-03-12T13:12:00Z"/>
+</w16cex:commentsExtensible>
+</file>
+
+<file path=word/commentsIds.xml><?xml version="1.0" encoding="utf-8"?>
+<w16cid:commentsIds xmlns:wpc="http://schemas.microsoft.com/office/word/2010/wordprocessingCanvas" xmlns:cx="http://schemas.microsoft.com/office/drawing/2014/chartex" xmlns:cx1="http://schemas.microsoft.com/office/drawing/2015/9/8/chartex" xmlns:cx2="http://schemas.microsoft.com/office/drawing/2015/10/21/chartex" xmlns:cx3="http://schemas.microsoft.com/office/drawing/2016/5/9/chartex" xmlns:cx4="http://schemas.microsoft.com/office/drawing/2016/5/10/chartex" xmlns:cx5="http://schemas.microsoft.com/office/drawing/2016/5/11/chartex" xmlns:cx6="http://schemas.microsoft.com/office/drawing/2016/5/12/chartex" xmlns:cx7="http://schemas.microsoft.com/office/drawing/2016/5/13/chartex" xmlns:cx8="http://schemas.microsoft.com/office/drawing/2016/5/14/chartex" xmlns:mc="http://schemas.openxmlformats.org/markup-compatibility/2006" xmlns:aink="http://schemas.microsoft.com/office/drawing/2016/ink" xmlns:am3d="http://schemas.microsoft.com/office/drawing/2017/model3d" xmlns:o="urn:schemas-microsoft-com:office:office" xmlns:r="http://schemas.openxmlformats.org/officeDocument/2006/relationships" xmlns:m="http://schemas.openxmlformats.org/officeDocument/2006/math" xmlns:v="urn:schemas-microsoft-com:vml" xmlns:wp14="http://schemas.microsoft.com/office/word/2010/wordprocessingDrawing" xmlns:wp="http://schemas.openxmlformats.org/drawingml/2006/wordprocessingDrawing" xmlns:w10="urn:schemas-microsoft-com:office:word" xmlns:w="http://schemas.openxmlformats.org/wordprocessingml/2006/main" xmlns:w14="http://schemas.microsoft.com/office/word/2010/wordml" xmlns:w15="http://schemas.microsoft.com/office/word/2012/wordml" xmlns:w16cex="http://schemas.microsoft.com/office/word/2018/wordml/cex" xmlns:w16cid="http://schemas.microsoft.com/office/word/2016/wordml/cid" xmlns:w16="http://schemas.microsoft.com/office/word/2018/wordml" xmlns:w16sdtdh="http://schemas.microsoft.com/office/word/2020/wordml/sdtdatahash" xmlns:w16se="http://schemas.microsoft.com/office/word/2015/wordml/symex" xmlns:wpg="http://schemas.microsoft.com/office/word/2010/wordprocessingGroup" xmlns:wpi="http://schemas.microsoft.com/office/word/2010/wordprocessingInk" xmlns:wne="http://schemas.microsoft.com/office/word/2006/wordml" xmlns:wps="http://schemas.microsoft.com/office/word/2010/wordprocessingShape" mc:Ignorable="w14 w15 w16se w16cid w16 w16cex w16sdtdh wp14">
+  <w16cid:commentId w16cid:paraId="36D0E36C" w16cid:durableId="2D5D4838"/>
+</w16cid:commentsIds>
+</file>
+
+<file path=word/people.xml><?xml version="1.0" encoding="utf-8"?>
+<w15:people xmlns:wpc="http://schemas.microsoft.com/office/word/2010/wordprocessingCanvas" xmlns:cx="http://schemas.microsoft.com/office/drawing/2014/chartex" xmlns:cx1="http://schemas.microsoft.com/office/drawing/2015/9/8/chartex" xmlns:cx2="http://schemas.microsoft.com/office/drawing/2015/10/21/chartex" xmlns:cx3="http://schemas.microsoft.com/office/drawing/2016/5/9/chartex" xmlns:cx4="http://schemas.microsoft.com/office/drawing/2016/5/10/chartex" xmlns:cx5="http://schemas.microsoft.com/office/drawing/2016/5/11/chartex" xmlns:cx6="http://schemas.microsoft.com/office/drawing/2016/5/12/chartex" xmlns:cx7="http://schemas.microsoft.com/office/drawing/2016/5/13/chartex" xmlns:cx8="http://schemas.microsoft.com/office/drawing/2016/5/14/chartex" xmlns:mc="http://schemas.openxmlformats.org/markup-compatibility/2006" xmlns:aink="http://schemas.microsoft.com/office/drawing/2016/ink" xmlns:am3d="http://schemas.microsoft.com/office/drawing/2017/model3d" xmlns:o="urn:schemas-microsoft-com:office:office" xmlns:r="http://schemas.openxmlformats.org/officeDocument/2006/relationships" xmlns:m="http://schemas.openxmlformats.org/officeDocument/2006/math" xmlns:v="urn:schemas-microsoft-com:vml" xmlns:wp14="http://schemas.microsoft.com/office/word/2010/wordprocessingDrawing" xmlns:wp="http://schemas.openxmlformats.org/drawingml/2006/wordprocessingDrawing" xmlns:w10="urn:schemas-microsoft-com:office:word" xmlns:w="http://schemas.openxmlformats.org/wordprocessingml/2006/main" xmlns:w14="http://schemas.microsoft.com/office/word/2010/wordml" xmlns:w15="http://schemas.microsoft.com/office/word/2012/wordml" xmlns:w16cex="http://schemas.microsoft.com/office/word/2018/wordml/cex" xmlns:w16cid="http://schemas.microsoft.com/office/word/2016/wordml/cid" xmlns:w16="http://schemas.microsoft.com/office/word/2018/wordml" xmlns:w16sdtdh="http://schemas.microsoft.com/office/word/2020/wordml/sdtdatahash" xmlns:w16se="http://schemas.microsoft.com/office/word/2015/wordml/symex" xmlns:wpg="http://schemas.microsoft.com/office/word/2010/wordprocessingGroup" xmlns:wpi="http://schemas.microsoft.com/office/word/2010/wordprocessingInk" xmlns:wne="http://schemas.microsoft.com/office/word/2006/wordml" xmlns:wps="http://schemas.microsoft.com/office/word/2010/wordprocessingShape" mc:Ignorable="w14 w15 w16se w16cid w16 w16cex w16sdtdh wp14">
+  <w15:person w15:author="Alexis PRETAT">
+    <w15:presenceInfo w15:providerId="None" w15:userId="Alexis PRETAT"/>
+  </w15:person>
+</w15:people>
 </file>
 
 <file path=word/styles.xml><?xml version="1.0" encoding="utf-8"?>
@@ -1298,6 +1625,74 @@
       <w:szCs w:val="32"/>
     </w:rPr>
   </w:style>
+  <w:style w:type="character" w:styleId="Marquedecommentaire">
+    <w:name w:val="annotation reference"/>
+    <w:basedOn w:val="Policepardfaut"/>
+    <w:uiPriority w:val="99"/>
+    <w:semiHidden/>
+    <w:unhideWhenUsed/>
+    <w:rsid w:val="00C04EE7"/>
+    <w:rPr>
+      <w:sz w:val="16"/>
+      <w:szCs w:val="16"/>
+    </w:rPr>
+  </w:style>
+  <w:style w:type="paragraph" w:styleId="Commentaire">
+    <w:name w:val="annotation text"/>
+    <w:basedOn w:val="Normal"/>
+    <w:link w:val="CommentaireCar"/>
+    <w:uiPriority w:val="99"/>
+    <w:semiHidden/>
+    <w:unhideWhenUsed/>
+    <w:rsid w:val="00C04EE7"/>
+    <w:pPr>
+      <w:spacing w:line="240" w:lineRule="auto"/>
+    </w:pPr>
+    <w:rPr>
+      <w:sz w:val="20"/>
+      <w:szCs w:val="20"/>
+    </w:rPr>
+  </w:style>
+  <w:style w:type="character" w:customStyle="1" w:styleId="CommentaireCar">
+    <w:name w:val="Commentaire Car"/>
+    <w:basedOn w:val="Policepardfaut"/>
+    <w:link w:val="Commentaire"/>
+    <w:uiPriority w:val="99"/>
+    <w:semiHidden/>
+    <w:rsid w:val="00C04EE7"/>
+    <w:rPr>
+      <w:sz w:val="20"/>
+      <w:szCs w:val="20"/>
+    </w:rPr>
+  </w:style>
+  <w:style w:type="paragraph" w:styleId="Objetducommentaire">
+    <w:name w:val="annotation subject"/>
+    <w:basedOn w:val="Commentaire"/>
+    <w:next w:val="Commentaire"/>
+    <w:link w:val="ObjetducommentaireCar"/>
+    <w:uiPriority w:val="99"/>
+    <w:semiHidden/>
+    <w:unhideWhenUsed/>
+    <w:rsid w:val="00C04EE7"/>
+    <w:rPr>
+      <w:b/>
+      <w:bCs/>
+    </w:rPr>
+  </w:style>
+  <w:style w:type="character" w:customStyle="1" w:styleId="ObjetducommentaireCar">
+    <w:name w:val="Objet du commentaire Car"/>
+    <w:basedOn w:val="CommentaireCar"/>
+    <w:link w:val="Objetducommentaire"/>
+    <w:uiPriority w:val="99"/>
+    <w:semiHidden/>
+    <w:rsid w:val="00C04EE7"/>
+    <w:rPr>
+      <w:b/>
+      <w:bCs/>
+      <w:sz w:val="20"/>
+      <w:szCs w:val="20"/>
+    </w:rPr>
+  </w:style>
 </w:styles>
 </file>
 

</xml_diff>

<commit_message>
Refactor sorensen function and add network plot
Refactor sorensen computation in SoilFariR_functions.r to correctly build pairwise Sorensen values: reorganized loops, use rowSums, allocate sormat incrementally, set self-comparisons to NA and return a full matrix. Update SoilFari_betadiv.R to capture the sorensen matrix, set row/column names, zero the diagonal and create an igraph from the weighted adjacency for quick visualization (added igraph dependency and a basic plot). Also update manuscript files: modified the 11mar2026 report and added a new 16mar2026 betadiv report.
</commit_message>
<xml_diff>
--- a/6-manuscripts/RAPPORT INTERMéDIAIRE - 11mar2026.docx
+++ b/6-manuscripts/RAPPORT INTERMéDIAIRE - 11mar2026.docx
@@ -388,21 +388,19 @@
         <w:rPr>
           <w:color w:val="000000" w:themeColor="text1"/>
         </w:rPr>
-        <w:t xml:space="preserve">Les courbes d’accumulation des espèces en fonction du temps sont dans </w:t>
-      </w:r>
-      <w:proofErr w:type="gramStart"/>
-      <w:r>
-        <w:rPr>
-          <w:color w:val="000000" w:themeColor="text1"/>
-        </w:rPr>
-        <w:t>les figure</w:t>
-      </w:r>
-      <w:proofErr w:type="gramEnd"/>
-      <w:r>
-        <w:rPr>
-          <w:color w:val="000000" w:themeColor="text1"/>
-        </w:rPr>
-        <w:t xml:space="preserve"> 1 et 2.</w:t>
+        <w:t>Les courbes d’accumulation des espèces en fonction du temps sont dans l</w:t>
+      </w:r>
+      <w:r>
+        <w:rPr>
+          <w:color w:val="000000" w:themeColor="text1"/>
+        </w:rPr>
+        <w:t>a figure 1</w:t>
+      </w:r>
+      <w:r>
+        <w:rPr>
+          <w:color w:val="000000" w:themeColor="text1"/>
+        </w:rPr>
+        <w:t>.</w:t>
       </w:r>
       <w:commentRangeEnd w:id="0"/>
       <w:r>
@@ -518,6 +516,50 @@
       </w:pPr>
       <w:r>
         <w:rPr>
+          <w:color w:val="000000" w:themeColor="text1"/>
+        </w:rPr>
+        <w:t xml:space="preserve">Figure 1. A : Accumulation de la richesse en taxa en fonction du temps, par milieux </w:t>
+      </w:r>
+      <w:proofErr w:type="spellStart"/>
+      <w:r>
+        <w:rPr>
+          <w:color w:val="000000" w:themeColor="text1"/>
+        </w:rPr>
+        <w:t>samplés</w:t>
+      </w:r>
+      <w:proofErr w:type="spellEnd"/>
+      <w:r>
+        <w:rPr>
+          <w:color w:val="000000" w:themeColor="text1"/>
+        </w:rPr>
+        <w:t xml:space="preserve">. B : accumulation de la richesse en taxa en fonction du temps, 1 graphe par </w:t>
+      </w:r>
+      <w:proofErr w:type="spellStart"/>
+      <w:proofErr w:type="gramStart"/>
+      <w:r>
+        <w:rPr>
+          <w:color w:val="000000" w:themeColor="text1"/>
+        </w:rPr>
+        <w:t>observateur.ices</w:t>
+      </w:r>
+      <w:proofErr w:type="spellEnd"/>
+      <w:proofErr w:type="gramEnd"/>
+      <w:r>
+        <w:rPr>
+          <w:color w:val="000000" w:themeColor="text1"/>
+        </w:rPr>
+        <w:t>, une courbe par transect.</w:t>
+      </w:r>
+    </w:p>
+    <w:p>
+      <w:pPr>
+        <w:jc w:val="center"/>
+        <w:rPr>
+          <w:color w:val="000000" w:themeColor="text1"/>
+        </w:rPr>
+      </w:pPr>
+      <w:r>
+        <w:rPr>
           <w:noProof/>
         </w:rPr>
         <w:lastRenderedPageBreak/>
@@ -568,38 +610,72 @@
     </w:p>
     <w:p>
       <w:pPr>
-        <w:rPr>
-          <w:color w:val="000000" w:themeColor="text1"/>
-        </w:rPr>
-      </w:pPr>
-      <w:r>
-        <w:rPr>
-          <w:color w:val="000000" w:themeColor="text1"/>
-        </w:rPr>
-        <w:br w:type="page"/>
-      </w:r>
-    </w:p>
-    <w:p>
-      <w:pPr>
-        <w:jc w:val="both"/>
-        <w:rPr>
-          <w:color w:val="000000" w:themeColor="text1"/>
-        </w:rPr>
-      </w:pPr>
-      <w:r>
-        <w:rPr>
-          <w:color w:val="000000" w:themeColor="text1"/>
-        </w:rPr>
-        <w:lastRenderedPageBreak/>
-        <w:t>Enfin, une dernière partie du script s’attache aux analyses de diversité multivariées. Le tableau 1 représente une partie du tableau utilisé pour les analyses, à savoir les taxa observés par chaque personne/transect.</w:t>
-      </w:r>
-    </w:p>
-    <w:p>
-      <w:pPr>
-        <w:jc w:val="both"/>
-      </w:pPr>
-      <w:r>
-        <w:t>Tableau 1. Tableau de contingence</w:t>
+        <w:jc w:val="center"/>
+        <w:rPr>
+          <w:color w:val="000000" w:themeColor="text1"/>
+        </w:rPr>
+      </w:pPr>
+      <w:r>
+        <w:rPr>
+          <w:color w:val="000000" w:themeColor="text1"/>
+        </w:rPr>
+        <w:t xml:space="preserve">Figure 2. Courbes de raréfactions, par </w:t>
+      </w:r>
+      <w:proofErr w:type="spellStart"/>
+      <w:proofErr w:type="gramStart"/>
+      <w:r>
+        <w:rPr>
+          <w:color w:val="000000" w:themeColor="text1"/>
+        </w:rPr>
+        <w:t>observateur.ices</w:t>
+      </w:r>
+      <w:proofErr w:type="spellEnd"/>
+      <w:proofErr w:type="gramEnd"/>
+      <w:r>
+        <w:rPr>
+          <w:color w:val="000000" w:themeColor="text1"/>
+        </w:rPr>
+        <w:t>.</w:t>
+      </w:r>
+    </w:p>
+    <w:p>
+      <w:pPr>
+        <w:jc w:val="both"/>
+        <w:rPr>
+          <w:color w:val="000000" w:themeColor="text1"/>
+        </w:rPr>
+      </w:pPr>
+      <w:r>
+        <w:rPr>
+          <w:color w:val="000000" w:themeColor="text1"/>
+        </w:rPr>
+        <w:t xml:space="preserve">Enfin, une dernière partie du script s’attache aux analyses de diversité multivariées. Le tableau </w:t>
+      </w:r>
+      <w:r>
+        <w:rPr>
+          <w:color w:val="000000" w:themeColor="text1"/>
+        </w:rPr>
+        <w:t>2</w:t>
+      </w:r>
+      <w:r>
+        <w:rPr>
+          <w:color w:val="000000" w:themeColor="text1"/>
+        </w:rPr>
+        <w:t xml:space="preserve"> représente une partie du tableau utilisé pour les analyses, à savoir les taxa observés par chaque personne/transect.</w:t>
+      </w:r>
+    </w:p>
+    <w:p>
+      <w:pPr>
+        <w:jc w:val="both"/>
+      </w:pPr>
+      <w:r>
+        <w:t xml:space="preserve">Tableau </w:t>
+      </w:r>
+      <w:r>
+        <w:t>2</w:t>
+      </w:r>
+      <w:r>
+        <w:t>. Tableau de contingence</w:t>
       </w:r>
       <w:r>
         <w:t xml:space="preserve"> *taxa* par *observateur / transect id*</w:t>
@@ -666,6 +742,7 @@
         <w:jc w:val="both"/>
       </w:pPr>
       <w:r>
+        <w:lastRenderedPageBreak/>
         <w:t>A partir de ce tableau,</w:t>
       </w:r>
       <w:r>
@@ -715,7 +792,13 @@
         <w:t>t</w:t>
       </w:r>
       <w:r>
-        <w:t xml:space="preserve"> le résumé des dimensions donne le tableau 2.</w:t>
+        <w:t xml:space="preserve"> le résumé des dimensions donne le tableau </w:t>
+      </w:r>
+      <w:r>
+        <w:t>3</w:t>
+      </w:r>
+      <w:r>
+        <w:t>.</w:t>
       </w:r>
     </w:p>
     <w:p>
@@ -723,7 +806,13 @@
         <w:jc w:val="center"/>
       </w:pPr>
       <w:r>
-        <w:t>Tableau 2. Variabilité expliquée par l’ACP.</w:t>
+        <w:t xml:space="preserve">Tableau </w:t>
+      </w:r>
+      <w:r>
+        <w:t>3</w:t>
+      </w:r>
+      <w:r>
+        <w:t>. Variabilité expliquée par l’ACP.</w:t>
       </w:r>
     </w:p>
     <w:p>
@@ -776,7 +865,13 @@
         <w:jc w:val="both"/>
       </w:pPr>
       <w:r>
-        <w:t>On en tire également le cercle des corrélations pour les différents axes (figure 1.)</w:t>
+        <w:t xml:space="preserve">On en tire également le cercle des corrélations pour les différents axes (figure </w:t>
+      </w:r>
+      <w:r>
+        <w:t>3</w:t>
+      </w:r>
+      <w:r>
+        <w:t>.)</w:t>
       </w:r>
     </w:p>
     <w:p>
@@ -792,11 +887,10 @@
         <w:rPr>
           <w:noProof/>
         </w:rPr>
-        <w:lastRenderedPageBreak/>
         <w:drawing>
-          <wp:inline distT="0" distB="0" distL="0" distR="0" wp14:anchorId="4366CD25" wp14:editId="760FF1F6">
-            <wp:extent cx="5799510" cy="5791200"/>
-            <wp:effectExtent l="0" t="0" r="0" b="0"/>
+          <wp:inline distT="0" distB="0" distL="0" distR="0" wp14:anchorId="4366CD25" wp14:editId="3B678E1B">
+            <wp:extent cx="5142230" cy="5134862"/>
+            <wp:effectExtent l="0" t="0" r="1270" b="8890"/>
             <wp:docPr id="2" name="Image 2"/>
             <wp:cNvGraphicFramePr>
               <a:graphicFrameLocks xmlns:a="http://schemas.openxmlformats.org/drawingml/2006/main" noChangeAspect="1"/>
@@ -817,7 +911,7 @@
                   <pic:spPr>
                     <a:xfrm>
                       <a:off x="0" y="0"/>
-                      <a:ext cx="5822614" cy="5814271"/>
+                      <a:ext cx="5168303" cy="5160897"/>
                     </a:xfrm>
                     <a:prstGeom prst="rect">
                       <a:avLst/>
@@ -835,7 +929,13 @@
         <w:jc w:val="both"/>
       </w:pPr>
       <w:r>
-        <w:t xml:space="preserve">Figure 1. Cercles des </w:t>
+        <w:t xml:space="preserve">Figure </w:t>
+      </w:r>
+      <w:r>
+        <w:t>3</w:t>
+      </w:r>
+      <w:r>
+        <w:t xml:space="preserve">. Cercles des </w:t>
       </w:r>
       <w:proofErr w:type="spellStart"/>
       <w:r>
@@ -908,7 +1008,13 @@
         <w:jc w:val="center"/>
       </w:pPr>
       <w:r>
-        <w:t xml:space="preserve">Figure 2. Diagramme de Shepard pour l’ACP sur les données de </w:t>
+        <w:t xml:space="preserve">Figure </w:t>
+      </w:r>
+      <w:r>
+        <w:t>4</w:t>
+      </w:r>
+      <w:r>
+        <w:t xml:space="preserve">. Diagramme de Shepard pour l’ACP sur les données de </w:t>
       </w:r>
       <w:proofErr w:type="spellStart"/>
       <w:r>
@@ -1033,7 +1139,13 @@
         </w:drawing>
       </w:r>
       <w:r>
-        <w:t>En vitesse, résumons les données des axes pour le TSBF + diagramme de Shepard : figure 3.</w:t>
+        <w:t xml:space="preserve">En vitesse, résumons les données des axes pour le TSBF + diagramme de Shepard : figure </w:t>
+      </w:r>
+      <w:r>
+        <w:t>5</w:t>
+      </w:r>
+      <w:r>
+        <w:t>.</w:t>
       </w:r>
       <w:r>
         <w:rPr>
@@ -1087,7 +1199,13 @@
         <w:jc w:val="both"/>
       </w:pPr>
       <w:r>
-        <w:t>Figure 3. Diagramme de Shepard et tableau de synthèse de la variance expliquée par les axes de l’ACP sur les données de TSBF.</w:t>
+        <w:t xml:space="preserve">Figure </w:t>
+      </w:r>
+      <w:r>
+        <w:t>5</w:t>
+      </w:r>
+      <w:r>
+        <w:t>. Diagramme de Shepard et tableau de synthèse de la variance expliquée par les axes de l’ACP sur les données de TSBF.</w:t>
       </w:r>
     </w:p>
     <w:p>

</xml_diff>